<commit_message>
surat eksekusi pengadilan done
</commit_message>
<xml_diff>
--- a/src/app/dashboard/surat/components/Template_permohonan_PN_DenganKuasa.docx
+++ b/src/app/dashboard/surat/components/Template_permohonan_PN_DenganKuasa.docx
@@ -15,9 +15,11 @@
         <w:spacing w:before="211"/>
         <w:ind w:left="218"/>
       </w:pPr>
-      <w:r>
-        <w:t>{{kota}}</w:t>
-      </w:r>
+      <w:proofErr w:type="spellStart"/>
+      <w:r>
+        <w:t>Surabaya</w:t>
+      </w:r>
+      <w:proofErr w:type="spellEnd"/>
       <w:r>
         <w:t xml:space="preserve">, </w:t>
       </w:r>
@@ -72,14 +74,16 @@
         <w:ind w:left="1946"/>
       </w:pPr>
       <w:r>
-        <w:t xml:space="preserve">Ketua Pengadilan Negeri </w:t>
-      </w:r>
-      <w:r>
-        <w:rPr>
-          <w:spacing w:val="-2"/>
-        </w:rPr>
-        <w:t>{{kota}}</w:t>
-      </w:r>
+        <w:t>Ketua Pengadilan Negeri</w:t>
+      </w:r>
+      <w:r>
+        <w:t xml:space="preserve"> </w:t>
+      </w:r>
+      <w:proofErr w:type="spellStart"/>
+      <w:r>
+        <w:t>Surabaya</w:t>
+      </w:r>
+      <w:proofErr w:type="spellEnd"/>
     </w:p>
     <w:p>
       <w:pPr>
@@ -91,25 +95,24 @@
         <w:t xml:space="preserve">Di – </w:t>
       </w:r>
       <w:r>
-        <w:t>{{</w:t>
-      </w:r>
-      <w:proofErr w:type="spellStart"/>
-      <w:r>
-        <w:t>alamat_PN</w:t>
-      </w:r>
-      <w:proofErr w:type="spellEnd"/>
-      <w:r>
-        <w:t>}}</w:t>
-      </w:r>
-      <w:r>
-        <w:t xml:space="preserve">, </w:t>
-      </w:r>
+        <w:t xml:space="preserve">Jalan </w:t>
+      </w:r>
+      <w:proofErr w:type="spellStart"/>
+      <w:r>
+        <w:t>Arjuno</w:t>
+      </w:r>
+      <w:proofErr w:type="spellEnd"/>
+      <w:r>
+        <w:t xml:space="preserve"> No. 16-18, </w:t>
+      </w:r>
+      <w:proofErr w:type="spellStart"/>
       <w:r>
         <w:rPr>
           <w:spacing w:val="-2"/>
         </w:rPr>
-        <w:t>{{kota}}</w:t>
-      </w:r>
+        <w:t>Surabaya</w:t>
+      </w:r>
+      <w:proofErr w:type="spellEnd"/>
       <w:r>
         <w:rPr>
           <w:spacing w:val="-2"/>
@@ -477,7 +480,7 @@
           <w:tab w:val="left" w:pos="2378"/>
         </w:tabs>
         <w:spacing w:line="360" w:lineRule="auto"/>
-        <w:ind w:left="218"/>
+        <w:ind w:left="2694" w:hanging="2476"/>
         <w:rPr>
           <w:sz w:val="24"/>
         </w:rPr>
@@ -859,7 +862,7 @@
           <w:tab w:val="left" w:pos="2378"/>
         </w:tabs>
         <w:spacing w:line="360" w:lineRule="auto"/>
-        <w:ind w:left="218"/>
+        <w:ind w:left="2694" w:hanging="2476"/>
         <w:rPr>
           <w:sz w:val="24"/>
         </w:rPr>
@@ -1253,7 +1256,109 @@
           <w:sz w:val="24"/>
           <w:szCs w:val="24"/>
         </w:rPr>
+        <w:t>{{</w:t>
+      </w:r>
+      <w:proofErr w:type="spellStart"/>
+      <w:r>
+        <w:rPr>
+          <w:b/>
+          <w:sz w:val="24"/>
+          <w:szCs w:val="24"/>
+        </w:rPr>
+        <w:t>jenis_sertifikat</w:t>
+      </w:r>
+      <w:proofErr w:type="spellEnd"/>
+      <w:r>
+        <w:rPr>
+          <w:b/>
+          <w:sz w:val="24"/>
+          <w:szCs w:val="24"/>
+        </w:rPr>
+        <w:t>}}</w:t>
+      </w:r>
+      <w:r>
+        <w:rPr>
+          <w:b/>
+          <w:sz w:val="24"/>
+          <w:szCs w:val="24"/>
+        </w:rPr>
+        <w:t xml:space="preserve"> (</w:t>
+      </w:r>
+      <w:r>
+        <w:rPr>
+          <w:b/>
+          <w:sz w:val="24"/>
+          <w:szCs w:val="24"/>
+        </w:rPr>
+        <w:t>{{</w:t>
+      </w:r>
+      <w:proofErr w:type="spellStart"/>
+      <w:r>
+        <w:rPr>
+          <w:b/>
+          <w:sz w:val="24"/>
+          <w:szCs w:val="24"/>
+        </w:rPr>
+        <w:t>singkatan_sertifikat</w:t>
+      </w:r>
+      <w:proofErr w:type="spellEnd"/>
+      <w:r>
+        <w:rPr>
+          <w:b/>
+          <w:sz w:val="24"/>
+          <w:szCs w:val="24"/>
+        </w:rPr>
+        <w:t>}}</w:t>
+      </w:r>
+      <w:r>
+        <w:rPr>
+          <w:b/>
+          <w:sz w:val="24"/>
+          <w:szCs w:val="24"/>
+        </w:rPr>
+        <w:t xml:space="preserve">) NIB </w:t>
+      </w:r>
+      <w:proofErr w:type="spellStart"/>
+      <w:r>
+        <w:rPr>
+          <w:b/>
+          <w:sz w:val="24"/>
+          <w:szCs w:val="24"/>
+        </w:rPr>
+        <w:t>Nomor</w:t>
+      </w:r>
+      <w:proofErr w:type="spellEnd"/>
+      <w:r>
+        <w:rPr>
+          <w:b/>
+          <w:sz w:val="24"/>
+          <w:szCs w:val="24"/>
+        </w:rPr>
+        <w:t xml:space="preserve"> : </w:t>
+      </w:r>
+      <w:r>
+        <w:rPr>
+          <w:b/>
+          <w:sz w:val="24"/>
+          <w:szCs w:val="24"/>
+        </w:rPr>
         <w:lastRenderedPageBreak/>
+        <w:t>{{nomor_nib}}</w:t>
+      </w:r>
+      <w:r>
+        <w:rPr>
+          <w:b/>
+          <w:sz w:val="24"/>
+          <w:szCs w:val="24"/>
+        </w:rPr>
+        <w:t xml:space="preserve"> Atas Nama </w:t>
+      </w:r>
+      <w:r>
+        <w:rPr>
+          <w:b/>
+          <w:sz w:val="24"/>
+          <w:szCs w:val="24"/>
+        </w:rPr>
         <w:t>{{</w:t>
       </w:r>
       <w:proofErr w:type="spellStart"/>
@@ -1263,7 +1368,7 @@
           <w:sz w:val="24"/>
           <w:szCs w:val="24"/>
         </w:rPr>
-        <w:t>jenis_sertifikat</w:t>
+        <w:t>nama_pemohon</w:t>
       </w:r>
       <w:proofErr w:type="spellEnd"/>
       <w:r>
@@ -1280,7 +1385,23 @@
           <w:sz w:val="24"/>
           <w:szCs w:val="24"/>
         </w:rPr>
-        <w:t xml:space="preserve"> (</w:t>
+        <w:t xml:space="preserve">, Luas tanah </w:t>
+      </w:r>
+      <w:r>
+        <w:rPr>
+          <w:b/>
+          <w:sz w:val="24"/>
+          <w:szCs w:val="24"/>
+        </w:rPr>
+        <w:t>{{LT}}</w:t>
+      </w:r>
+      <w:r>
+        <w:rPr>
+          <w:b/>
+          <w:sz w:val="24"/>
+          <w:szCs w:val="24"/>
+        </w:rPr>
+        <w:t xml:space="preserve"> M2 berlokasi di </w:t>
       </w:r>
       <w:r>
         <w:rPr>
@@ -1297,7 +1418,7 @@
           <w:sz w:val="24"/>
           <w:szCs w:val="24"/>
         </w:rPr>
-        <w:t>singkatan_sertifikat</w:t>
+        <w:t>lokasi_asset</w:t>
       </w:r>
       <w:proofErr w:type="spellEnd"/>
       <w:r>
@@ -1310,129 +1431,13 @@
       </w:r>
       <w:r>
         <w:rPr>
-          <w:b/>
-          <w:sz w:val="24"/>
-          <w:szCs w:val="24"/>
-        </w:rPr>
-        <w:t xml:space="preserve">) NIB </w:t>
-      </w:r>
-      <w:proofErr w:type="spellStart"/>
-      <w:r>
-        <w:rPr>
-          <w:b/>
-          <w:sz w:val="24"/>
-          <w:szCs w:val="24"/>
-        </w:rPr>
-        <w:t>Nomor</w:t>
-      </w:r>
-      <w:proofErr w:type="spellEnd"/>
-      <w:r>
-        <w:rPr>
-          <w:b/>
-          <w:sz w:val="24"/>
-          <w:szCs w:val="24"/>
-        </w:rPr>
-        <w:t xml:space="preserve"> : </w:t>
-      </w:r>
-      <w:r>
-        <w:rPr>
-          <w:b/>
-          <w:sz w:val="24"/>
-          <w:szCs w:val="24"/>
-        </w:rPr>
-        <w:t>{{nomor_nib}}</w:t>
-      </w:r>
-      <w:r>
-        <w:rPr>
-          <w:b/>
-          <w:sz w:val="24"/>
-          <w:szCs w:val="24"/>
-        </w:rPr>
-        <w:t xml:space="preserve"> Atas Nama </w:t>
-      </w:r>
-      <w:r>
-        <w:rPr>
-          <w:b/>
-          <w:sz w:val="24"/>
-          <w:szCs w:val="24"/>
-        </w:rPr>
-        <w:t>{{</w:t>
-      </w:r>
-      <w:proofErr w:type="spellStart"/>
-      <w:r>
-        <w:rPr>
-          <w:b/>
-          <w:sz w:val="24"/>
-          <w:szCs w:val="24"/>
-        </w:rPr>
-        <w:t>nama_pemohon</w:t>
-      </w:r>
-      <w:proofErr w:type="spellEnd"/>
-      <w:r>
-        <w:rPr>
-          <w:b/>
-          <w:sz w:val="24"/>
-          <w:szCs w:val="24"/>
-        </w:rPr>
-        <w:t>}}</w:t>
-      </w:r>
-      <w:r>
-        <w:rPr>
-          <w:b/>
-          <w:sz w:val="24"/>
-          <w:szCs w:val="24"/>
-        </w:rPr>
-        <w:t xml:space="preserve">, Luas tanah </w:t>
-      </w:r>
-      <w:r>
-        <w:rPr>
-          <w:b/>
-          <w:sz w:val="24"/>
-          <w:szCs w:val="24"/>
-        </w:rPr>
-        <w:t>{{LT}}</w:t>
-      </w:r>
-      <w:r>
-        <w:rPr>
-          <w:b/>
-          <w:sz w:val="24"/>
-          <w:szCs w:val="24"/>
-        </w:rPr>
-        <w:t xml:space="preserve"> M2 berlokasi di </w:t>
-      </w:r>
-      <w:r>
-        <w:rPr>
-          <w:b/>
-          <w:sz w:val="24"/>
-          <w:szCs w:val="24"/>
-        </w:rPr>
-        <w:t>{{</w:t>
-      </w:r>
-      <w:proofErr w:type="spellStart"/>
-      <w:r>
-        <w:rPr>
-          <w:b/>
-          <w:sz w:val="24"/>
-          <w:szCs w:val="24"/>
-        </w:rPr>
-        <w:t>lokasi_asset</w:t>
-      </w:r>
-      <w:proofErr w:type="spellEnd"/>
-      <w:r>
-        <w:rPr>
-          <w:b/>
-          <w:sz w:val="24"/>
-          <w:szCs w:val="24"/>
-        </w:rPr>
-        <w:t>}}</w:t>
-      </w:r>
-      <w:r>
-        <w:rPr>
           <w:sz w:val="24"/>
           <w:szCs w:val="24"/>
         </w:rPr>
         <w:t>, terhadap :</w:t>
       </w:r>
+      <w:bookmarkStart w:id="0" w:name="_GoBack"/>
+      <w:bookmarkEnd w:id="0"/>
     </w:p>
     <w:p>
       <w:pPr>
@@ -1456,7 +1461,7 @@
           <w:tab w:val="left" w:pos="2378"/>
         </w:tabs>
         <w:spacing w:line="360" w:lineRule="auto"/>
-        <w:ind w:left="218" w:right="272"/>
+        <w:ind w:left="2694" w:right="272" w:hanging="2476"/>
         <w:jc w:val="both"/>
         <w:rPr>
           <w:b/>
@@ -1514,8 +1519,7 @@
           <w:tab w:val="left" w:pos="2378"/>
         </w:tabs>
         <w:spacing w:line="360" w:lineRule="auto"/>
-        <w:ind w:left="218" w:right="272"/>
-        <w:jc w:val="both"/>
+        <w:ind w:left="2694" w:right="272" w:hanging="2476"/>
         <w:rPr>
           <w:b/>
           <w:sz w:val="24"/>
@@ -1537,7 +1541,15 @@
           <w:sz w:val="24"/>
         </w:rPr>
         <w:tab/>
-        <w:t xml:space="preserve">: </w:t>
+        <w:t>:</w:t>
+      </w:r>
+      <w:r>
+        <w:rPr>
+          <w:b/>
+          <w:color w:val="000000" w:themeColor="text1"/>
+          <w:sz w:val="24"/>
+        </w:rPr>
+        <w:tab/>
       </w:r>
       <w:r>
         <w:rPr>
@@ -1771,7 +1783,25 @@
           <w:sz w:val="24"/>
           <w:szCs w:val="24"/>
         </w:rPr>
-        <w:t>{{nomor_nib}}</w:t>
+        <w:t>{{</w:t>
+      </w:r>
+      <w:proofErr w:type="spellStart"/>
+      <w:r>
+        <w:rPr>
+          <w:b/>
+          <w:sz w:val="24"/>
+          <w:szCs w:val="24"/>
+        </w:rPr>
+        <w:t>nomor_nib</w:t>
+      </w:r>
+      <w:proofErr w:type="spellEnd"/>
+      <w:r>
+        <w:rPr>
+          <w:b/>
+          <w:sz w:val="24"/>
+          <w:szCs w:val="24"/>
+        </w:rPr>
+        <w:t>}}</w:t>
       </w:r>
       <w:r>
         <w:rPr>
@@ -1813,7 +1843,23 @@
           <w:sz w:val="24"/>
           <w:szCs w:val="24"/>
         </w:rPr>
-        <w:t xml:space="preserve">, Luas tanah </w:t>
+        <w:t>,</w:t>
+      </w:r>
+      <w:r>
+        <w:rPr>
+          <w:b/>
+          <w:sz w:val="24"/>
+          <w:szCs w:val="24"/>
+        </w:rPr>
+        <w:t xml:space="preserve"> </w:t>
+      </w:r>
+      <w:r>
+        <w:rPr>
+          <w:b/>
+          <w:sz w:val="24"/>
+          <w:szCs w:val="24"/>
+        </w:rPr>
+        <w:t xml:space="preserve">Luas tanah </w:t>
       </w:r>
       <w:r>
         <w:rPr>
@@ -3136,7 +3182,14 @@
         <w:rPr>
           <w:sz w:val="24"/>
         </w:rPr>
-        <w:t xml:space="preserve">tanah dan bangunan </w:t>
+        <w:t xml:space="preserve">tanah </w:t>
+      </w:r>
+      <w:r>
+        <w:rPr>
+          <w:sz w:val="24"/>
+        </w:rPr>
+        <w:lastRenderedPageBreak/>
+        <w:t xml:space="preserve">dan bangunan </w:t>
       </w:r>
       <w:r>
         <w:rPr>
@@ -4359,7 +4412,7 @@
       <w:pPr>
         <w:pStyle w:val="Heading3"/>
         <w:spacing w:before="172"/>
-        <w:ind w:left="3098" w:right="435" w:firstLine="502"/>
+        <w:ind w:left="2835" w:right="3122" w:firstLine="851"/>
       </w:pPr>
       <w:r>
         <w:t xml:space="preserve">  {{</w:t>
@@ -4381,6 +4434,11 @@
       </w:pPr>
     </w:p>
     <w:p>
+      <w:r>
+        <w:br w:type="page"/>
+      </w:r>
+    </w:p>
+    <w:p>
       <w:pPr>
         <w:rPr>
           <w:b/>
@@ -4389,9 +4447,6 @@
           <w:szCs w:val="24"/>
         </w:rPr>
       </w:pPr>
-      <w:r>
-        <w:br w:type="page"/>
-      </w:r>
     </w:p>
     <w:p>
       <w:pPr>
@@ -4406,7 +4461,6 @@
         <w:rPr>
           <w:rFonts w:ascii="Times New Roman"/>
         </w:rPr>
-        <w:lastRenderedPageBreak/>
         <w:t>Kepada</w:t>
       </w:r>
       <w:r>
@@ -4484,14 +4538,16 @@
         </w:rPr>
         <w:t xml:space="preserve"> </w:t>
       </w:r>
+      <w:proofErr w:type="spellStart"/>
       <w:r>
         <w:rPr>
           <w:rFonts w:ascii="Times New Roman"/>
           <w:b/>
           <w:sz w:val="24"/>
         </w:rPr>
-        <w:t>{{kota}}</w:t>
-      </w:r>
+        <w:t>Surabaya</w:t>
+      </w:r>
+      <w:proofErr w:type="spellEnd"/>
       <w:r>
         <w:rPr>
           <w:rFonts w:ascii="Times New Roman"/>
@@ -4500,107 +4556,69 @@
         </w:rPr>
         <w:br/>
       </w:r>
+      <w:proofErr w:type="spellStart"/>
       <w:r>
         <w:rPr>
           <w:rFonts w:ascii="Times New Roman"/>
           <w:sz w:val="24"/>
         </w:rPr>
-        <w:t>{{</w:t>
-      </w:r>
-      <w:proofErr w:type="spellStart"/>
+        <w:t>Jl</w:t>
+      </w:r>
+      <w:proofErr w:type="spellEnd"/>
       <w:r>
         <w:rPr>
           <w:rFonts w:ascii="Times New Roman"/>
           <w:sz w:val="24"/>
         </w:rPr>
-        <w:t>alamat_pn</w:t>
-      </w:r>
-      <w:proofErr w:type="spellEnd"/>
+        <w:t xml:space="preserve">. Raya </w:t>
+      </w:r>
+      <w:proofErr w:type="spellStart"/>
       <w:r>
         <w:rPr>
           <w:rFonts w:ascii="Times New Roman"/>
           <w:sz w:val="24"/>
         </w:rPr>
-        <w:t>}}</w:t>
-      </w:r>
+        <w:t>Arjuno</w:t>
+      </w:r>
+      <w:proofErr w:type="spellEnd"/>
       <w:r>
         <w:rPr>
           <w:rFonts w:ascii="Times New Roman"/>
           <w:sz w:val="24"/>
         </w:rPr>
-        <w:t xml:space="preserve">, </w:t>
-      </w:r>
+        <w:t xml:space="preserve"> No. 16-18, </w:t>
+      </w:r>
+      <w:proofErr w:type="spellStart"/>
       <w:r>
         <w:rPr>
           <w:rFonts w:ascii="Times New Roman"/>
           <w:sz w:val="24"/>
         </w:rPr>
-        <w:t>{{kecamatan}}</w:t>
-      </w:r>
+        <w:t>Sawahan</w:t>
+      </w:r>
+      <w:proofErr w:type="spellEnd"/>
       <w:r>
         <w:rPr>
           <w:rFonts w:ascii="Times New Roman"/>
           <w:sz w:val="24"/>
         </w:rPr>
-        <w:br/>
-      </w:r>
+        <w:t xml:space="preserve"> Kota </w:t>
+      </w:r>
+      <w:proofErr w:type="spellStart"/>
       <w:r>
         <w:rPr>
           <w:rFonts w:ascii="Times New Roman"/>
           <w:sz w:val="24"/>
         </w:rPr>
-        <w:t xml:space="preserve">Kota </w:t>
-      </w:r>
+        <w:t>Surabaya</w:t>
+      </w:r>
+      <w:proofErr w:type="spellEnd"/>
       <w:r>
         <w:rPr>
           <w:rFonts w:ascii="Times New Roman"/>
           <w:sz w:val="24"/>
         </w:rPr>
-        <w:t>{{kota}}</w:t>
-      </w:r>
-      <w:r>
-        <w:rPr>
-          <w:rFonts w:ascii="Times New Roman"/>
-          <w:sz w:val="24"/>
-        </w:rPr>
-        <w:t xml:space="preserve">, </w:t>
-      </w:r>
-      <w:r>
-        <w:rPr>
-          <w:rFonts w:ascii="Times New Roman"/>
-          <w:sz w:val="24"/>
-        </w:rPr>
-        <w:t>{{provinsi}}</w:t>
-      </w:r>
-      <w:r>
-        <w:rPr>
-          <w:rFonts w:ascii="Times New Roman"/>
-          <w:sz w:val="24"/>
-        </w:rPr>
-        <w:t xml:space="preserve"> </w:t>
-      </w:r>
-      <w:r>
-        <w:rPr>
-          <w:rFonts w:ascii="Times New Roman"/>
-          <w:sz w:val="24"/>
-        </w:rPr>
-        <w:t>{{</w:t>
-      </w:r>
-      <w:proofErr w:type="spellStart"/>
-      <w:r>
-        <w:rPr>
-          <w:rFonts w:ascii="Times New Roman"/>
-          <w:sz w:val="24"/>
-        </w:rPr>
-        <w:t>kode_pos</w:t>
-      </w:r>
-      <w:proofErr w:type="spellEnd"/>
-      <w:r>
-        <w:rPr>
-          <w:rFonts w:ascii="Times New Roman"/>
-          <w:sz w:val="24"/>
-        </w:rPr>
-        <w:t>}}</w:t>
+        <w:t>, Jawa Timur 60251</w:t>
       </w:r>
     </w:p>
     <w:p>
@@ -6220,12 +6238,6 @@
     </w:p>
     <w:p>
       <w:pPr>
-        <w:pStyle w:val="TableParagraph"/>
-        <w:spacing w:line="360" w:lineRule="auto"/>
-      </w:pPr>
-    </w:p>
-    <w:p>
-      <w:pPr>
         <w:pStyle w:val="BodyText"/>
         <w:spacing w:before="68"/>
         <w:ind w:left="458"/>
@@ -6328,6 +6340,163 @@
     </w:p>
     <w:p>
       <w:pPr>
+        <w:rPr>
+          <w:rFonts w:ascii="Times New Roman" w:hAnsi="Times New Roman" w:cs="Times New Roman"/>
+          <w:spacing w:val="-4"/>
+          <w:sz w:val="24"/>
+          <w:szCs w:val="24"/>
+        </w:rPr>
+      </w:pPr>
+      <w:r>
+        <w:rPr>
+          <w:rFonts w:ascii="Times New Roman" w:hAnsi="Times New Roman" w:cs="Times New Roman"/>
+          <w:spacing w:val="-4"/>
+        </w:rPr>
+        <w:br/>
+      </w:r>
+      <w:r>
+        <w:rPr>
+          <w:rFonts w:ascii="Times New Roman" w:hAnsi="Times New Roman" w:cs="Times New Roman"/>
+          <w:spacing w:val="-4"/>
+          <w:sz w:val="24"/>
+          <w:szCs w:val="24"/>
+        </w:rPr>
+        <w:br/>
+      </w:r>
+    </w:p>
+    <w:p>
+      <w:pPr>
+        <w:rPr>
+          <w:rFonts w:ascii="Times New Roman" w:hAnsi="Times New Roman" w:cs="Times New Roman"/>
+          <w:spacing w:val="-4"/>
+          <w:sz w:val="24"/>
+          <w:szCs w:val="24"/>
+        </w:rPr>
+      </w:pPr>
+    </w:p>
+    <w:p>
+      <w:pPr>
+        <w:pStyle w:val="BodyText"/>
+        <w:spacing w:before="68"/>
+        <w:ind w:left="3686" w:right="4" w:hanging="3653"/>
+        <w:jc w:val="center"/>
+        <w:rPr>
+          <w:rFonts w:ascii="Times New Roman" w:hAnsi="Times New Roman" w:cs="Times New Roman"/>
+          <w:spacing w:val="-4"/>
+        </w:rPr>
+      </w:pPr>
+      <w:proofErr w:type="spellStart"/>
+      <w:r>
+        <w:rPr>
+          <w:rFonts w:ascii="Times New Roman" w:hAnsi="Times New Roman" w:cs="Times New Roman"/>
+          <w:spacing w:val="-4"/>
+        </w:rPr>
+        <w:t>Surabaya</w:t>
+      </w:r>
+      <w:proofErr w:type="spellEnd"/>
+      <w:r>
+        <w:rPr>
+          <w:rFonts w:ascii="Times New Roman" w:hAnsi="Times New Roman" w:cs="Times New Roman"/>
+          <w:spacing w:val="-4"/>
+        </w:rPr>
+        <w:t xml:space="preserve">, </w:t>
+      </w:r>
+      <w:r>
+        <w:rPr>
+          <w:rFonts w:ascii="Times New Roman" w:hAnsi="Times New Roman" w:cs="Times New Roman"/>
+          <w:spacing w:val="-4"/>
+        </w:rPr>
+        <w:t>{{</w:t>
+      </w:r>
+      <w:proofErr w:type="spellStart"/>
+      <w:r>
+        <w:rPr>
+          <w:rFonts w:ascii="Times New Roman" w:hAnsi="Times New Roman" w:cs="Times New Roman"/>
+          <w:spacing w:val="-4"/>
+        </w:rPr>
+        <w:t>tanggal_surat</w:t>
+      </w:r>
+      <w:proofErr w:type="spellEnd"/>
+      <w:r>
+        <w:rPr>
+          <w:rFonts w:ascii="Times New Roman" w:hAnsi="Times New Roman" w:cs="Times New Roman"/>
+          <w:spacing w:val="-4"/>
+        </w:rPr>
+        <w:t>}}</w:t>
+      </w:r>
+    </w:p>
+    <w:p>
+      <w:pPr>
+        <w:spacing w:before="1" w:line="504" w:lineRule="auto"/>
+        <w:ind w:left="4605" w:right="3724"/>
+        <w:rPr>
+          <w:rFonts w:ascii="Times New Roman" w:hAnsi="Times New Roman" w:cs="Times New Roman"/>
+          <w:b/>
+          <w:sz w:val="24"/>
+        </w:rPr>
+      </w:pPr>
+      <w:r>
+        <w:rPr>
+          <w:rFonts w:ascii="Times New Roman" w:hAnsi="Times New Roman" w:cs="Times New Roman"/>
+          <w:sz w:val="24"/>
+        </w:rPr>
+        <w:t>Hormat kami</w:t>
+      </w:r>
+    </w:p>
+    <w:p>
+      <w:pPr>
+        <w:spacing w:before="1" w:line="504" w:lineRule="auto"/>
+        <w:ind w:left="3885" w:right="3724" w:firstLine="288"/>
+        <w:rPr>
+          <w:rFonts w:ascii="Times New Roman" w:hAnsi="Times New Roman" w:cs="Times New Roman"/>
+          <w:b/>
+          <w:sz w:val="24"/>
+        </w:rPr>
+      </w:pPr>
+    </w:p>
+    <w:p>
+      <w:pPr>
+        <w:pStyle w:val="Heading3"/>
+        <w:spacing w:before="172"/>
+        <w:ind w:left="0" w:right="435"/>
+        <w:rPr>
+          <w:rFonts w:ascii="Times New Roman" w:hAnsi="Times New Roman" w:cs="Times New Roman"/>
+        </w:rPr>
+      </w:pPr>
+    </w:p>
+    <w:p>
+      <w:pPr>
+        <w:pStyle w:val="Heading3"/>
+        <w:spacing w:before="172"/>
+        <w:ind w:left="2977" w:right="2839"/>
+        <w:jc w:val="center"/>
+        <w:rPr>
+          <w:rFonts w:ascii="Times New Roman" w:hAnsi="Times New Roman" w:cs="Times New Roman"/>
+        </w:rPr>
+      </w:pPr>
+      <w:r>
+        <w:rPr>
+          <w:rFonts w:ascii="Times New Roman" w:hAnsi="Times New Roman" w:cs="Times New Roman"/>
+        </w:rPr>
+        <w:t>{{</w:t>
+      </w:r>
+      <w:proofErr w:type="spellStart"/>
+      <w:r>
+        <w:rPr>
+          <w:rFonts w:ascii="Times New Roman" w:hAnsi="Times New Roman" w:cs="Times New Roman"/>
+        </w:rPr>
+        <w:t>nama_kuasa</w:t>
+      </w:r>
+      <w:proofErr w:type="spellEnd"/>
+      <w:r>
+        <w:rPr>
+          <w:rFonts w:ascii="Times New Roman" w:hAnsi="Times New Roman" w:cs="Times New Roman"/>
+        </w:rPr>
+        <w:t>}}</w:t>
+      </w:r>
+    </w:p>
+    <w:p>
+      <w:pPr>
         <w:pStyle w:val="BodyText"/>
         <w:spacing w:before="68"/>
         <w:ind w:left="458"/>
@@ -6336,2203 +6505,14 @@
           <w:spacing w:val="-4"/>
         </w:rPr>
       </w:pPr>
-      <w:r>
-        <w:rPr>
-          <w:rFonts w:ascii="Times New Roman" w:hAnsi="Times New Roman" w:cs="Times New Roman"/>
-          <w:spacing w:val="-4"/>
-        </w:rPr>
-        <w:br/>
-      </w:r>
-      <w:r>
-        <w:rPr>
-          <w:rFonts w:ascii="Times New Roman" w:hAnsi="Times New Roman" w:cs="Times New Roman"/>
-          <w:spacing w:val="-4"/>
-        </w:rPr>
-        <w:br/>
-      </w:r>
-      <w:r>
-        <w:rPr>
-          <w:rFonts w:ascii="Times New Roman" w:hAnsi="Times New Roman" w:cs="Times New Roman"/>
-          <w:spacing w:val="-4"/>
-        </w:rPr>
-        <w:br/>
-      </w:r>
-      <w:r>
-        <w:rPr>
-          <w:rFonts w:ascii="Times New Roman" w:hAnsi="Times New Roman" w:cs="Times New Roman"/>
-          <w:spacing w:val="-4"/>
-        </w:rPr>
-        <w:br/>
-      </w:r>
     </w:p>
     <w:p>
       <w:pPr>
         <w:pStyle w:val="BodyText"/>
         <w:spacing w:before="68"/>
         <w:ind w:left="458"/>
-        <w:jc w:val="center"/>
-        <w:rPr>
-          <w:rFonts w:ascii="Times New Roman" w:hAnsi="Times New Roman" w:cs="Times New Roman"/>
-          <w:spacing w:val="-4"/>
-        </w:rPr>
-      </w:pPr>
-      <w:bookmarkStart w:id="0" w:name="_GoBack"/>
-      <w:r>
-        <w:rPr>
-          <w:rFonts w:ascii="Times New Roman" w:hAnsi="Times New Roman" w:cs="Times New Roman"/>
-          <w:spacing w:val="-4"/>
-        </w:rPr>
-        <w:lastRenderedPageBreak/>
-        <w:t>{{kota}}</w:t>
-      </w:r>
-      <w:r>
-        <w:rPr>
-          <w:rFonts w:ascii="Times New Roman" w:hAnsi="Times New Roman" w:cs="Times New Roman"/>
-          <w:spacing w:val="-4"/>
-        </w:rPr>
-        <w:t xml:space="preserve">, </w:t>
-      </w:r>
-      <w:r>
-        <w:rPr>
-          <w:rFonts w:ascii="Times New Roman" w:hAnsi="Times New Roman" w:cs="Times New Roman"/>
-          <w:spacing w:val="-4"/>
-        </w:rPr>
-        <w:t>{{</w:t>
-      </w:r>
-      <w:proofErr w:type="spellStart"/>
-      <w:r>
-        <w:rPr>
-          <w:rFonts w:ascii="Times New Roman" w:hAnsi="Times New Roman" w:cs="Times New Roman"/>
-          <w:spacing w:val="-4"/>
-        </w:rPr>
-        <w:t>tanggal_surat</w:t>
-      </w:r>
-      <w:proofErr w:type="spellEnd"/>
-      <w:r>
-        <w:rPr>
-          <w:rFonts w:ascii="Times New Roman" w:hAnsi="Times New Roman" w:cs="Times New Roman"/>
-          <w:spacing w:val="-4"/>
-        </w:rPr>
-        <w:t>}}</w:t>
-      </w:r>
-    </w:p>
-    <w:p>
-      <w:pPr>
-        <w:spacing w:before="1" w:line="504" w:lineRule="auto"/>
-        <w:ind w:left="4605" w:right="3724"/>
-        <w:rPr>
-          <w:rFonts w:ascii="Times New Roman" w:hAnsi="Times New Roman" w:cs="Times New Roman"/>
-          <w:b/>
-          <w:sz w:val="24"/>
-        </w:rPr>
-      </w:pPr>
-      <w:r>
-        <w:rPr>
-          <w:rFonts w:ascii="Times New Roman" w:hAnsi="Times New Roman" w:cs="Times New Roman"/>
-          <w:sz w:val="24"/>
-        </w:rPr>
-        <w:t>Hormat kami</w:t>
-      </w:r>
-    </w:p>
-    <w:p>
-      <w:pPr>
-        <w:spacing w:before="1" w:line="504" w:lineRule="auto"/>
-        <w:ind w:left="3885" w:right="3724" w:firstLine="288"/>
-        <w:rPr>
-          <w:rFonts w:ascii="Times New Roman" w:hAnsi="Times New Roman" w:cs="Times New Roman"/>
-          <w:b/>
-          <w:sz w:val="24"/>
-        </w:rPr>
-      </w:pPr>
-    </w:p>
-    <w:p>
-      <w:pPr>
-        <w:pStyle w:val="Heading3"/>
-        <w:spacing w:before="172"/>
-        <w:ind w:left="0" w:right="435"/>
-        <w:rPr>
-          <w:rFonts w:ascii="Times New Roman" w:hAnsi="Times New Roman" w:cs="Times New Roman"/>
-        </w:rPr>
-      </w:pPr>
-    </w:p>
-    <w:p>
-      <w:pPr>
-        <w:pStyle w:val="Heading3"/>
-        <w:spacing w:before="172"/>
-        <w:ind w:left="3600" w:right="435"/>
-        <w:rPr>
-          <w:rFonts w:ascii="Times New Roman" w:hAnsi="Times New Roman" w:cs="Times New Roman"/>
-        </w:rPr>
-      </w:pPr>
-      <w:r>
-        <w:rPr>
-          <w:rFonts w:ascii="Times New Roman" w:hAnsi="Times New Roman" w:cs="Times New Roman"/>
-        </w:rPr>
-        <w:t xml:space="preserve">    </w:t>
-      </w:r>
-      <w:r>
-        <w:rPr>
-          <w:rFonts w:ascii="Times New Roman" w:hAnsi="Times New Roman" w:cs="Times New Roman"/>
-        </w:rPr>
-        <w:tab/>
-      </w:r>
-      <w:r>
-        <w:rPr>
-          <w:rFonts w:ascii="Times New Roman" w:hAnsi="Times New Roman" w:cs="Times New Roman"/>
-        </w:rPr>
-        <w:t>{{</w:t>
-      </w:r>
-      <w:proofErr w:type="spellStart"/>
-      <w:r>
-        <w:rPr>
-          <w:rFonts w:ascii="Times New Roman" w:hAnsi="Times New Roman" w:cs="Times New Roman"/>
-        </w:rPr>
-        <w:t>nama_kuasa</w:t>
-      </w:r>
-      <w:proofErr w:type="spellEnd"/>
-      <w:r>
-        <w:rPr>
-          <w:rFonts w:ascii="Times New Roman" w:hAnsi="Times New Roman" w:cs="Times New Roman"/>
-        </w:rPr>
-        <w:t>}}</w:t>
-      </w:r>
-      <w:bookmarkEnd w:id="0"/>
-    </w:p>
-    <w:p>
-      <w:pPr>
-        <w:pStyle w:val="BodyText"/>
-        <w:spacing w:before="68"/>
-        <w:ind w:left="458"/>
-        <w:rPr>
-          <w:rFonts w:ascii="Times New Roman" w:hAnsi="Times New Roman" w:cs="Times New Roman"/>
-          <w:spacing w:val="-4"/>
-        </w:rPr>
-      </w:pPr>
-    </w:p>
-    <w:p>
-      <w:pPr>
-        <w:pStyle w:val="BodyText"/>
-        <w:spacing w:before="68"/>
-        <w:ind w:left="458"/>
         <w:rPr>
           <w:rFonts w:ascii="Times New Roman"/>
-          <w:spacing w:val="-4"/>
-        </w:rPr>
-      </w:pPr>
-    </w:p>
-    <w:p>
-      <w:pPr>
-        <w:pStyle w:val="BodyText"/>
-        <w:spacing w:before="68"/>
-        <w:ind w:left="458"/>
-        <w:rPr>
-          <w:rFonts w:ascii="Times New Roman"/>
-          <w:spacing w:val="-4"/>
-        </w:rPr>
-      </w:pPr>
-    </w:p>
-    <w:p>
-      <w:pPr>
-        <w:pStyle w:val="BodyText"/>
-        <w:spacing w:before="68"/>
-        <w:ind w:left="458"/>
-        <w:rPr>
-          <w:rFonts w:ascii="Times New Roman"/>
-          <w:spacing w:val="-4"/>
-        </w:rPr>
-      </w:pPr>
-    </w:p>
-    <w:p>
-      <w:pPr>
-        <w:pStyle w:val="BodyText"/>
-        <w:spacing w:before="1"/>
-        <w:sectPr>
-          <w:type w:val="continuous"/>
-          <w:pgSz w:w="11910" w:h="16840"/>
-          <w:pgMar w:top="580" w:right="566" w:bottom="0" w:left="992" w:header="720" w:footer="720" w:gutter="0"/>
-          <w:cols w:space="720"/>
-        </w:sectPr>
-      </w:pPr>
-    </w:p>
-    <w:p>
-      <w:pPr>
-        <w:rPr>
-          <w:sz w:val="24"/>
-        </w:rPr>
-        <w:sectPr>
-          <w:pgSz w:w="11910" w:h="16840"/>
-          <w:pgMar w:top="810" w:right="566" w:bottom="280" w:left="992" w:header="720" w:footer="720" w:gutter="0"/>
-          <w:cols w:space="720"/>
-        </w:sectPr>
-      </w:pPr>
-    </w:p>
-    <w:p>
-      <w:pPr>
-        <w:pStyle w:val="BodyText"/>
-        <w:spacing w:before="238"/>
-        <w:rPr>
-          <w:b/>
-        </w:rPr>
-      </w:pPr>
-    </w:p>
-    <w:p>
-      <w:pPr>
-        <w:pStyle w:val="BodyText"/>
-        <w:spacing w:before="206"/>
-        <w:ind w:left="462"/>
-        <w:rPr>
-          <w:rFonts w:ascii="Times New Roman"/>
-        </w:rPr>
-      </w:pPr>
-    </w:p>
-    <w:p>
-      <w:pPr>
-        <w:pStyle w:val="BodyText"/>
-        <w:spacing w:before="206"/>
-        <w:ind w:left="462"/>
-        <w:rPr>
-          <w:rFonts w:ascii="Times New Roman"/>
-        </w:rPr>
-      </w:pPr>
-      <w:r>
-        <w:rPr>
-          <w:rFonts w:ascii="Times New Roman"/>
-        </w:rPr>
-        <w:t>Kepada</w:t>
-      </w:r>
-      <w:r>
-        <w:rPr>
-          <w:rFonts w:ascii="Times New Roman"/>
-          <w:spacing w:val="-8"/>
-        </w:rPr>
-        <w:t xml:space="preserve"> </w:t>
-      </w:r>
-      <w:r>
-        <w:rPr>
-          <w:rFonts w:ascii="Times New Roman"/>
-          <w:spacing w:val="-4"/>
-        </w:rPr>
-        <w:t>Yth,</w:t>
-      </w:r>
-    </w:p>
-    <w:p>
-      <w:pPr>
-        <w:spacing w:before="41" w:line="278" w:lineRule="auto"/>
-        <w:ind w:left="462" w:right="6114"/>
-        <w:rPr>
-          <w:rFonts w:ascii="Times New Roman"/>
-          <w:sz w:val="24"/>
-        </w:rPr>
-      </w:pPr>
-      <w:r>
-        <w:rPr>
-          <w:rFonts w:ascii="Times New Roman"/>
-          <w:b/>
-          <w:sz w:val="24"/>
-        </w:rPr>
-        <w:t>Ketua</w:t>
-      </w:r>
-      <w:r>
-        <w:rPr>
-          <w:rFonts w:ascii="Times New Roman"/>
-          <w:b/>
-          <w:spacing w:val="-15"/>
-          <w:sz w:val="24"/>
-        </w:rPr>
-        <w:t xml:space="preserve"> </w:t>
-      </w:r>
-      <w:r>
-        <w:rPr>
-          <w:rFonts w:ascii="Times New Roman"/>
-          <w:b/>
-          <w:sz w:val="24"/>
-        </w:rPr>
-        <w:t>Pengadilan</w:t>
-      </w:r>
-      <w:r>
-        <w:rPr>
-          <w:rFonts w:ascii="Times New Roman"/>
-          <w:b/>
-          <w:spacing w:val="-15"/>
-          <w:sz w:val="24"/>
-        </w:rPr>
-        <w:t xml:space="preserve"> </w:t>
-      </w:r>
-      <w:r>
-        <w:rPr>
-          <w:rFonts w:ascii="Times New Roman"/>
-          <w:b/>
-          <w:sz w:val="24"/>
-        </w:rPr>
-        <w:t>Negeri</w:t>
-      </w:r>
-      <w:r>
-        <w:rPr>
-          <w:rFonts w:ascii="Times New Roman"/>
-          <w:b/>
-          <w:spacing w:val="-15"/>
-          <w:sz w:val="24"/>
-        </w:rPr>
-        <w:t xml:space="preserve"> </w:t>
-      </w:r>
-      <w:r>
-        <w:rPr>
-          <w:rFonts w:ascii="Times New Roman"/>
-          <w:b/>
-          <w:sz w:val="24"/>
-        </w:rPr>
-        <w:t xml:space="preserve">Surabaya </w:t>
-      </w:r>
-      <w:r>
-        <w:rPr>
-          <w:rFonts w:ascii="Times New Roman"/>
-          <w:sz w:val="24"/>
-        </w:rPr>
-        <w:t>Jl. Raya Arjuno No. 16-18, Sawahan Kota Surabaya, Jawa Timur 60251</w:t>
-      </w:r>
-    </w:p>
-    <w:p>
-      <w:pPr>
-        <w:pStyle w:val="BodyText"/>
-        <w:spacing w:before="26"/>
-        <w:rPr>
-          <w:rFonts w:ascii="Times New Roman"/>
-        </w:rPr>
-      </w:pPr>
-    </w:p>
-    <w:p>
-      <w:pPr>
-        <w:pStyle w:val="Heading3"/>
-        <w:tabs>
-          <w:tab w:val="left" w:pos="1900"/>
-        </w:tabs>
-        <w:ind w:left="460"/>
-        <w:rPr>
-          <w:rFonts w:ascii="Times New Roman"/>
-        </w:rPr>
-      </w:pPr>
-      <w:r>
-        <w:rPr>
-          <w:rFonts w:ascii="Times New Roman"/>
-          <w:spacing w:val="-5"/>
-        </w:rPr>
-        <w:t>Hal</w:t>
-      </w:r>
-      <w:r>
-        <w:rPr>
-          <w:rFonts w:ascii="Times New Roman"/>
-        </w:rPr>
-        <w:tab/>
-        <w:t>:</w:t>
-      </w:r>
-      <w:r>
-        <w:rPr>
-          <w:rFonts w:ascii="Times New Roman"/>
-          <w:spacing w:val="-2"/>
-        </w:rPr>
-        <w:t xml:space="preserve"> </w:t>
-      </w:r>
-      <w:r>
-        <w:rPr>
-          <w:rFonts w:ascii="Times New Roman"/>
-          <w:u w:val="thick"/>
-        </w:rPr>
-        <w:t>Alat Bukti</w:t>
-      </w:r>
-      <w:r>
-        <w:rPr>
-          <w:rFonts w:ascii="Times New Roman"/>
-          <w:spacing w:val="-3"/>
-          <w:u w:val="thick"/>
-        </w:rPr>
-        <w:t xml:space="preserve"> </w:t>
-      </w:r>
-      <w:r>
-        <w:rPr>
-          <w:rFonts w:ascii="Times New Roman"/>
-          <w:u w:val="thick"/>
-        </w:rPr>
-        <w:t xml:space="preserve">Surat </w:t>
-      </w:r>
-      <w:r>
-        <w:rPr>
-          <w:rFonts w:ascii="Times New Roman"/>
-          <w:spacing w:val="-2"/>
-          <w:u w:val="thick"/>
-        </w:rPr>
-        <w:t>Pemohon</w:t>
-      </w:r>
-    </w:p>
-    <w:p>
-      <w:pPr>
-        <w:pStyle w:val="BodyText"/>
-        <w:spacing w:before="180"/>
-        <w:ind w:left="460"/>
-        <w:jc w:val="both"/>
-        <w:rPr>
-          <w:rFonts w:ascii="Times New Roman"/>
-        </w:rPr>
-      </w:pPr>
-      <w:r>
-        <w:rPr>
-          <w:rFonts w:ascii="Times New Roman"/>
-        </w:rPr>
-        <w:t>Dengan</w:t>
-      </w:r>
-      <w:r>
-        <w:rPr>
-          <w:rFonts w:ascii="Times New Roman"/>
-          <w:spacing w:val="-5"/>
-        </w:rPr>
-        <w:t xml:space="preserve"> </w:t>
-      </w:r>
-      <w:r>
-        <w:rPr>
-          <w:rFonts w:ascii="Times New Roman"/>
-          <w:spacing w:val="-2"/>
-        </w:rPr>
-        <w:t>Hormat,</w:t>
-      </w:r>
-    </w:p>
-    <w:p>
-      <w:pPr>
-        <w:pStyle w:val="BodyText"/>
-        <w:spacing w:before="41" w:line="278" w:lineRule="auto"/>
-        <w:ind w:left="460" w:right="782"/>
-        <w:jc w:val="both"/>
-        <w:rPr>
-          <w:rFonts w:ascii="Times New Roman" w:hAnsi="Times New Roman"/>
-        </w:rPr>
-      </w:pPr>
-      <w:r>
-        <w:rPr>
-          <w:rFonts w:ascii="Times New Roman" w:hAnsi="Times New Roman"/>
-          <w:spacing w:val="-2"/>
-        </w:rPr>
-        <w:t>A</w:t>
-      </w:r>
-      <w:r>
-        <w:rPr>
-          <w:rFonts w:ascii="Times New Roman" w:hAnsi="Times New Roman"/>
-          <w:spacing w:val="-2"/>
-        </w:rPr>
-        <w:t>tas</w:t>
-      </w:r>
-      <w:r>
-        <w:rPr>
-          <w:rFonts w:ascii="Times New Roman" w:hAnsi="Times New Roman"/>
-          <w:spacing w:val="-12"/>
-        </w:rPr>
-        <w:t xml:space="preserve"> </w:t>
-      </w:r>
-      <w:r>
-        <w:rPr>
-          <w:rFonts w:ascii="Times New Roman" w:hAnsi="Times New Roman"/>
-          <w:spacing w:val="-2"/>
-        </w:rPr>
-        <w:t>nama</w:t>
-      </w:r>
-      <w:r>
-        <w:rPr>
-          <w:rFonts w:ascii="Times New Roman" w:hAnsi="Times New Roman"/>
-          <w:spacing w:val="-12"/>
-        </w:rPr>
-        <w:t xml:space="preserve"> </w:t>
-      </w:r>
-      <w:r>
-        <w:rPr>
-          <w:rFonts w:ascii="Times New Roman" w:hAnsi="Times New Roman"/>
-          <w:spacing w:val="-2"/>
-        </w:rPr>
-        <w:t xml:space="preserve">Pemohon dengan </w:t>
-      </w:r>
-      <w:r>
-        <w:rPr>
-          <w:rFonts w:ascii="Times New Roman" w:hAnsi="Times New Roman"/>
-        </w:rPr>
-        <w:t>ini</w:t>
-      </w:r>
-      <w:r>
-        <w:rPr>
-          <w:rFonts w:ascii="Times New Roman" w:hAnsi="Times New Roman"/>
-          <w:spacing w:val="-11"/>
-        </w:rPr>
-        <w:t xml:space="preserve"> </w:t>
-      </w:r>
-      <w:r>
-        <w:rPr>
-          <w:rFonts w:ascii="Times New Roman" w:hAnsi="Times New Roman"/>
-        </w:rPr>
-        <w:t>mengajukan</w:t>
-      </w:r>
-      <w:r>
-        <w:rPr>
-          <w:rFonts w:ascii="Times New Roman" w:hAnsi="Times New Roman"/>
-          <w:spacing w:val="-11"/>
-        </w:rPr>
-        <w:t xml:space="preserve"> </w:t>
-      </w:r>
-      <w:r>
-        <w:rPr>
-          <w:rFonts w:ascii="Times New Roman" w:hAnsi="Times New Roman"/>
-        </w:rPr>
-        <w:t>Alat</w:t>
-      </w:r>
-      <w:r>
-        <w:rPr>
-          <w:rFonts w:ascii="Times New Roman" w:hAnsi="Times New Roman"/>
-          <w:spacing w:val="-11"/>
-        </w:rPr>
-        <w:t xml:space="preserve"> </w:t>
-      </w:r>
-      <w:r>
-        <w:rPr>
-          <w:rFonts w:ascii="Times New Roman" w:hAnsi="Times New Roman"/>
-        </w:rPr>
-        <w:t>Bukti</w:t>
-      </w:r>
-      <w:r>
-        <w:rPr>
-          <w:rFonts w:ascii="Times New Roman" w:hAnsi="Times New Roman"/>
-          <w:spacing w:val="-11"/>
-        </w:rPr>
-        <w:t xml:space="preserve"> </w:t>
-      </w:r>
-      <w:r>
-        <w:rPr>
-          <w:rFonts w:ascii="Times New Roman" w:hAnsi="Times New Roman"/>
-        </w:rPr>
-        <w:t>Pemohon sebagai berikut:</w:t>
-      </w:r>
-    </w:p>
-    <w:p>
-      <w:pPr>
-        <w:pStyle w:val="BodyText"/>
-        <w:spacing w:before="2"/>
-        <w:rPr>
-          <w:rFonts w:ascii="Times New Roman"/>
-          <w:sz w:val="19"/>
-        </w:rPr>
-      </w:pPr>
-    </w:p>
-    <w:tbl>
-      <w:tblPr>
-        <w:tblW w:w="0" w:type="auto"/>
-        <w:tblInd w:w="228" w:type="dxa"/>
-        <w:tblBorders>
-          <w:top w:val="single" w:sz="4" w:space="0" w:color="000000"/>
-          <w:left w:val="single" w:sz="4" w:space="0" w:color="000000"/>
-          <w:bottom w:val="single" w:sz="4" w:space="0" w:color="000000"/>
-          <w:right w:val="single" w:sz="4" w:space="0" w:color="000000"/>
-          <w:insideH w:val="single" w:sz="4" w:space="0" w:color="000000"/>
-          <w:insideV w:val="single" w:sz="4" w:space="0" w:color="000000"/>
-        </w:tblBorders>
-        <w:tblLayout w:type="fixed"/>
-        <w:tblCellMar>
-          <w:left w:w="0" w:type="dxa"/>
-          <w:right w:w="0" w:type="dxa"/>
-        </w:tblCellMar>
-        <w:tblLook w:val="01E0" w:firstRow="1" w:lastRow="1" w:firstColumn="1" w:lastColumn="1" w:noHBand="0" w:noVBand="0"/>
-      </w:tblPr>
-      <w:tblGrid>
-        <w:gridCol w:w="1138"/>
-        <w:gridCol w:w="3567"/>
-        <w:gridCol w:w="3092"/>
-        <w:gridCol w:w="1988"/>
-      </w:tblGrid>
-      <w:tr>
-        <w:trPr>
-          <w:trHeight w:val="758"/>
-        </w:trPr>
-        <w:tc>
-          <w:tcPr>
-            <w:tcW w:w="1138" w:type="dxa"/>
-          </w:tcPr>
-          <w:p>
-            <w:pPr>
-              <w:pStyle w:val="TableParagraph"/>
-              <w:ind w:left="246"/>
-              <w:rPr>
-                <w:b/>
-              </w:rPr>
-            </w:pPr>
-            <w:r>
-              <w:rPr>
-                <w:b/>
-                <w:spacing w:val="-2"/>
-              </w:rPr>
-              <w:t>Nomor</w:t>
-            </w:r>
-          </w:p>
-          <w:p>
-            <w:pPr>
-              <w:pStyle w:val="TableParagraph"/>
-              <w:spacing w:before="126"/>
-              <w:ind w:left="327"/>
-              <w:rPr>
-                <w:b/>
-              </w:rPr>
-            </w:pPr>
-            <w:r>
-              <w:rPr>
-                <w:b/>
-                <w:spacing w:val="-4"/>
-              </w:rPr>
-              <w:t>Kode</w:t>
-            </w:r>
-          </w:p>
-        </w:tc>
-        <w:tc>
-          <w:tcPr>
-            <w:tcW w:w="3567" w:type="dxa"/>
-          </w:tcPr>
-          <w:p>
-            <w:pPr>
-              <w:pStyle w:val="TableParagraph"/>
-              <w:ind w:left="8"/>
-              <w:jc w:val="center"/>
-              <w:rPr>
-                <w:b/>
-              </w:rPr>
-            </w:pPr>
-            <w:r>
-              <w:rPr>
-                <w:b/>
-              </w:rPr>
-              <w:t>Alat</w:t>
-            </w:r>
-            <w:r>
-              <w:rPr>
-                <w:b/>
-                <w:spacing w:val="-8"/>
-              </w:rPr>
-              <w:t xml:space="preserve"> </w:t>
-            </w:r>
-            <w:r>
-              <w:rPr>
-                <w:b/>
-                <w:spacing w:val="-2"/>
-              </w:rPr>
-              <w:t>Bukti</w:t>
-            </w:r>
-          </w:p>
-        </w:tc>
-        <w:tc>
-          <w:tcPr>
-            <w:tcW w:w="3092" w:type="dxa"/>
-          </w:tcPr>
-          <w:p>
-            <w:pPr>
-              <w:pStyle w:val="TableParagraph"/>
-              <w:ind w:left="586"/>
-              <w:rPr>
-                <w:b/>
-              </w:rPr>
-            </w:pPr>
-            <w:r>
-              <w:rPr>
-                <w:b/>
-              </w:rPr>
-              <w:t>Muatan</w:t>
-            </w:r>
-            <w:r>
-              <w:rPr>
-                <w:b/>
-                <w:spacing w:val="-13"/>
-              </w:rPr>
-              <w:t xml:space="preserve"> </w:t>
-            </w:r>
-            <w:r>
-              <w:rPr>
-                <w:b/>
-                <w:spacing w:val="-2"/>
-              </w:rPr>
-              <w:t>Pembuktian</w:t>
-            </w:r>
-          </w:p>
-        </w:tc>
-        <w:tc>
-          <w:tcPr>
-            <w:tcW w:w="1988" w:type="dxa"/>
-          </w:tcPr>
-          <w:p>
-            <w:pPr>
-              <w:pStyle w:val="TableParagraph"/>
-              <w:ind w:left="446"/>
-              <w:rPr>
-                <w:b/>
-              </w:rPr>
-            </w:pPr>
-            <w:r>
-              <w:rPr>
-                <w:b/>
-                <w:spacing w:val="-2"/>
-              </w:rPr>
-              <w:t>Keterangan</w:t>
-            </w:r>
-          </w:p>
-        </w:tc>
-      </w:tr>
-      <w:tr>
-        <w:trPr>
-          <w:trHeight w:val="762"/>
-        </w:trPr>
-        <w:tc>
-          <w:tcPr>
-            <w:tcW w:w="1138" w:type="dxa"/>
-          </w:tcPr>
-          <w:p>
-            <w:pPr>
-              <w:pStyle w:val="TableParagraph"/>
-              <w:ind w:left="11"/>
-              <w:jc w:val="center"/>
-            </w:pPr>
-            <w:r>
-              <w:rPr>
-                <w:spacing w:val="-2"/>
-              </w:rPr>
-              <w:t>P-</w:t>
-            </w:r>
-            <w:r>
-              <w:rPr>
-                <w:spacing w:val="-10"/>
-              </w:rPr>
-              <w:t>1</w:t>
-            </w:r>
-          </w:p>
-        </w:tc>
-        <w:tc>
-          <w:tcPr>
-            <w:tcW w:w="3567" w:type="dxa"/>
-          </w:tcPr>
-          <w:p>
-            <w:pPr>
-              <w:pStyle w:val="TableParagraph"/>
-              <w:rPr>
-                <w:b/>
-              </w:rPr>
-            </w:pPr>
-            <w:r>
-              <w:t>Kartu</w:t>
-            </w:r>
-            <w:r>
-              <w:rPr>
-                <w:spacing w:val="8"/>
-              </w:rPr>
-              <w:t xml:space="preserve"> </w:t>
-            </w:r>
-            <w:r>
-              <w:t>Tanda</w:t>
-            </w:r>
-            <w:r>
-              <w:rPr>
-                <w:spacing w:val="15"/>
-              </w:rPr>
-              <w:t xml:space="preserve"> </w:t>
-            </w:r>
-            <w:r>
-              <w:t>Penduduk</w:t>
-            </w:r>
-            <w:r>
-              <w:rPr>
-                <w:spacing w:val="-2"/>
-              </w:rPr>
-              <w:t xml:space="preserve"> </w:t>
-            </w:r>
-            <w:r>
-              <w:t>An.</w:t>
-            </w:r>
-            <w:r>
-              <w:rPr>
-                <w:spacing w:val="63"/>
-                <w:w w:val="150"/>
-              </w:rPr>
-              <w:t xml:space="preserve"> </w:t>
-            </w:r>
-            <w:r>
-              <w:rPr>
-                <w:b/>
-                <w:spacing w:val="-2"/>
-              </w:rPr>
-              <w:t>Venatha Tanoto</w:t>
-            </w:r>
-          </w:p>
-        </w:tc>
-        <w:tc>
-          <w:tcPr>
-            <w:tcW w:w="3092" w:type="dxa"/>
-          </w:tcPr>
-          <w:p>
-            <w:pPr>
-              <w:pStyle w:val="TableParagraph"/>
-              <w:spacing w:before="0" w:line="254" w:lineRule="exact"/>
-              <w:ind w:left="109" w:right="92"/>
-              <w:jc w:val="both"/>
-            </w:pPr>
-            <w:r>
-              <w:t xml:space="preserve">Bahwa bukti ini membuktikan dan menunjukan identitas </w:t>
-            </w:r>
-            <w:r>
-              <w:rPr>
-                <w:spacing w:val="-2"/>
-              </w:rPr>
-              <w:t>pemohon;</w:t>
-            </w:r>
-          </w:p>
-        </w:tc>
-        <w:tc>
-          <w:tcPr>
-            <w:tcW w:w="1988" w:type="dxa"/>
-          </w:tcPr>
-          <w:p>
-            <w:pPr>
-              <w:pStyle w:val="TableParagraph"/>
-              <w:tabs>
-                <w:tab w:val="left" w:pos="491"/>
-                <w:tab w:val="left" w:pos="1265"/>
-              </w:tabs>
-              <w:ind w:left="108"/>
-            </w:pPr>
-            <w:r>
-              <w:rPr>
-                <w:spacing w:val="-10"/>
-              </w:rPr>
-              <w:t>1</w:t>
-            </w:r>
-            <w:r>
-              <w:tab/>
-            </w:r>
-            <w:r>
-              <w:rPr>
-                <w:spacing w:val="-2"/>
-              </w:rPr>
-              <w:t>(satu)</w:t>
-            </w:r>
-            <w:r>
-              <w:tab/>
-            </w:r>
-            <w:r>
-              <w:rPr>
-                <w:spacing w:val="-2"/>
-              </w:rPr>
-              <w:t>lembar</w:t>
-            </w:r>
-          </w:p>
-          <w:p>
-            <w:pPr>
-              <w:pStyle w:val="TableParagraph"/>
-              <w:spacing w:before="126"/>
-              <w:ind w:left="108"/>
-            </w:pPr>
-            <w:r>
-              <w:t>Copy</w:t>
-            </w:r>
-            <w:r>
-              <w:rPr>
-                <w:spacing w:val="-7"/>
-              </w:rPr>
-              <w:t xml:space="preserve"> </w:t>
-            </w:r>
-            <w:r>
-              <w:t>dari</w:t>
-            </w:r>
-            <w:r>
-              <w:rPr>
-                <w:spacing w:val="-13"/>
-              </w:rPr>
-              <w:t xml:space="preserve"> </w:t>
-            </w:r>
-            <w:r>
-              <w:rPr>
-                <w:spacing w:val="-4"/>
-              </w:rPr>
-              <w:t>Asli</w:t>
-            </w:r>
-          </w:p>
-        </w:tc>
-      </w:tr>
-      <w:tr>
-        <w:trPr>
-          <w:trHeight w:val="2274"/>
-        </w:trPr>
-        <w:tc>
-          <w:tcPr>
-            <w:tcW w:w="1138" w:type="dxa"/>
-          </w:tcPr>
-          <w:p>
-            <w:pPr>
-              <w:pStyle w:val="TableParagraph"/>
-              <w:ind w:left="11"/>
-              <w:jc w:val="center"/>
-            </w:pPr>
-            <w:r>
-              <w:rPr>
-                <w:spacing w:val="-2"/>
-              </w:rPr>
-              <w:t>P-</w:t>
-            </w:r>
-            <w:r>
-              <w:rPr>
-                <w:spacing w:val="-5"/>
-              </w:rPr>
-              <w:t>2</w:t>
-            </w:r>
-          </w:p>
-        </w:tc>
-        <w:tc>
-          <w:tcPr>
-            <w:tcW w:w="3567" w:type="dxa"/>
-          </w:tcPr>
-          <w:p>
-            <w:pPr>
-              <w:pStyle w:val="TableParagraph"/>
-              <w:rPr>
-                <w:b/>
-              </w:rPr>
-            </w:pPr>
-            <w:r>
-              <w:t>NIB</w:t>
-            </w:r>
-            <w:r>
-              <w:rPr>
-                <w:spacing w:val="-3"/>
-              </w:rPr>
-              <w:t xml:space="preserve"> </w:t>
-            </w:r>
-            <w:r>
-              <w:t>Nomor</w:t>
-            </w:r>
-            <w:r>
-              <w:rPr>
-                <w:spacing w:val="-3"/>
-              </w:rPr>
-              <w:t xml:space="preserve"> </w:t>
-            </w:r>
-            <w:r>
-              <w:t>:</w:t>
-            </w:r>
-            <w:r>
-              <w:rPr>
-                <w:spacing w:val="-3"/>
-              </w:rPr>
-              <w:t xml:space="preserve"> </w:t>
-            </w:r>
-            <w:r>
-              <w:rPr>
-                <w:b/>
-                <w:sz w:val="24"/>
-                <w:szCs w:val="24"/>
-              </w:rPr>
-              <w:t>12.01.000028021</w:t>
-            </w:r>
-            <w:r>
-              <w:rPr>
-                <w:b/>
-                <w:sz w:val="24"/>
-                <w:szCs w:val="24"/>
-              </w:rPr>
-              <w:t>.0</w:t>
-            </w:r>
-          </w:p>
-          <w:p>
-            <w:pPr>
-              <w:pStyle w:val="TableParagraph"/>
-              <w:spacing w:before="126"/>
-              <w:rPr>
-                <w:b/>
-              </w:rPr>
-            </w:pPr>
-            <w:r>
-              <w:t>Atas Nama RONALD NUSSY</w:t>
-            </w:r>
-          </w:p>
-        </w:tc>
-        <w:tc>
-          <w:tcPr>
-            <w:tcW w:w="3092" w:type="dxa"/>
-          </w:tcPr>
-          <w:p>
-            <w:pPr>
-              <w:pStyle w:val="TableParagraph"/>
-              <w:spacing w:line="360" w:lineRule="auto"/>
-              <w:ind w:left="109" w:right="92"/>
-              <w:jc w:val="both"/>
-            </w:pPr>
-            <w:r>
-              <w:t>Bahwa bukti ini membuktikan dan</w:t>
-            </w:r>
-            <w:r>
-              <w:rPr>
-                <w:spacing w:val="-5"/>
-              </w:rPr>
-              <w:t xml:space="preserve"> </w:t>
-            </w:r>
-            <w:r>
-              <w:t>menunjukkan</w:t>
-            </w:r>
-            <w:r>
-              <w:rPr>
-                <w:spacing w:val="-5"/>
-              </w:rPr>
-              <w:t xml:space="preserve"> </w:t>
-            </w:r>
-            <w:r>
-              <w:t>legal</w:t>
-            </w:r>
-            <w:r>
-              <w:rPr>
-                <w:spacing w:val="-5"/>
-              </w:rPr>
-              <w:t xml:space="preserve"> </w:t>
-            </w:r>
-            <w:r>
-              <w:t>standing pemohon sebagai pemilik atas Sertipikat Hak Milik termasuk tanah</w:t>
-            </w:r>
-            <w:r>
-              <w:rPr>
-                <w:spacing w:val="-7"/>
-              </w:rPr>
-              <w:t xml:space="preserve"> </w:t>
-            </w:r>
-            <w:r>
-              <w:t>dan</w:t>
-            </w:r>
-            <w:r>
-              <w:rPr>
-                <w:spacing w:val="-7"/>
-              </w:rPr>
-              <w:t xml:space="preserve"> </w:t>
-            </w:r>
-            <w:r>
-              <w:t>bangunan</w:t>
-            </w:r>
-            <w:r>
-              <w:rPr>
-                <w:spacing w:val="-7"/>
-              </w:rPr>
-              <w:t xml:space="preserve"> </w:t>
-            </w:r>
-            <w:r>
-              <w:t>yang</w:t>
-            </w:r>
-            <w:r>
-              <w:rPr>
-                <w:spacing w:val="-7"/>
-              </w:rPr>
-              <w:t xml:space="preserve"> </w:t>
-            </w:r>
-            <w:r>
-              <w:rPr>
-                <w:spacing w:val="-2"/>
-              </w:rPr>
-              <w:t>berdiri</w:t>
-            </w:r>
-          </w:p>
-          <w:p>
-            <w:pPr>
-              <w:pStyle w:val="TableParagraph"/>
-              <w:spacing w:before="0" w:line="252" w:lineRule="exact"/>
-              <w:ind w:left="109"/>
-            </w:pPr>
-            <w:r>
-              <w:rPr>
-                <w:spacing w:val="-2"/>
-              </w:rPr>
-              <w:t>diatasnya;</w:t>
-            </w:r>
-          </w:p>
-        </w:tc>
-        <w:tc>
-          <w:tcPr>
-            <w:tcW w:w="1988" w:type="dxa"/>
-          </w:tcPr>
-          <w:p>
-            <w:pPr>
-              <w:pStyle w:val="TableParagraph"/>
-              <w:tabs>
-                <w:tab w:val="left" w:pos="549"/>
-                <w:tab w:val="left" w:pos="1265"/>
-              </w:tabs>
-              <w:spacing w:line="360" w:lineRule="auto"/>
-              <w:ind w:left="108" w:right="99"/>
-            </w:pPr>
-            <w:r>
-              <w:rPr>
-                <w:spacing w:val="-10"/>
-              </w:rPr>
-              <w:t>1</w:t>
-            </w:r>
-            <w:r>
-              <w:tab/>
-            </w:r>
-            <w:r>
-              <w:rPr>
-                <w:spacing w:val="-2"/>
-              </w:rPr>
-              <w:t>(</w:t>
-            </w:r>
-            <w:r>
-              <w:rPr>
-                <w:spacing w:val="-2"/>
-              </w:rPr>
-              <w:t>satu</w:t>
-            </w:r>
-            <w:r>
-              <w:rPr>
-                <w:spacing w:val="-2"/>
-              </w:rPr>
-              <w:t>)</w:t>
-            </w:r>
-            <w:r>
-              <w:tab/>
-            </w:r>
-            <w:r>
-              <w:rPr>
-                <w:spacing w:val="-2"/>
-              </w:rPr>
-              <w:t xml:space="preserve">lembar </w:t>
-            </w:r>
-            <w:r>
-              <w:t>Copy dari Asli</w:t>
-            </w:r>
-          </w:p>
-        </w:tc>
-      </w:tr>
-      <w:tr>
-        <w:trPr>
-          <w:trHeight w:val="2274"/>
-        </w:trPr>
-        <w:tc>
-          <w:tcPr>
-            <w:tcW w:w="1138" w:type="dxa"/>
-          </w:tcPr>
-          <w:p>
-            <w:pPr>
-              <w:pStyle w:val="TableParagraph"/>
-              <w:ind w:left="11"/>
-              <w:jc w:val="center"/>
-              <w:rPr>
-                <w:spacing w:val="-2"/>
-              </w:rPr>
-            </w:pPr>
-            <w:r>
-              <w:rPr>
-                <w:spacing w:val="-2"/>
-              </w:rPr>
-              <w:t>P-</w:t>
-            </w:r>
-            <w:r>
-              <w:rPr>
-                <w:spacing w:val="-5"/>
-              </w:rPr>
-              <w:t>3</w:t>
-            </w:r>
-          </w:p>
-        </w:tc>
-        <w:tc>
-          <w:tcPr>
-            <w:tcW w:w="3567" w:type="dxa"/>
-          </w:tcPr>
-          <w:p>
-            <w:pPr>
-              <w:pStyle w:val="TableParagraph"/>
-            </w:pPr>
-            <w:r>
-              <w:t>NIB</w:t>
-            </w:r>
-            <w:r>
-              <w:rPr>
-                <w:spacing w:val="-3"/>
-              </w:rPr>
-              <w:t xml:space="preserve"> </w:t>
-            </w:r>
-            <w:proofErr w:type="spellStart"/>
-            <w:r>
-              <w:t>Nomor</w:t>
-            </w:r>
-            <w:proofErr w:type="spellEnd"/>
-            <w:r>
-              <w:rPr>
-                <w:spacing w:val="-3"/>
-              </w:rPr>
-              <w:t xml:space="preserve"> </w:t>
-            </w:r>
-            <w:r>
-              <w:t>:</w:t>
-            </w:r>
-            <w:r>
-              <w:rPr>
-                <w:spacing w:val="-3"/>
-              </w:rPr>
-              <w:t xml:space="preserve"> </w:t>
-            </w:r>
-            <w:r>
-              <w:rPr>
-                <w:b/>
-                <w:sz w:val="24"/>
-                <w:szCs w:val="24"/>
-              </w:rPr>
-              <w:t>12.01.000028022</w:t>
-            </w:r>
-            <w:r>
-              <w:rPr>
-                <w:b/>
-                <w:sz w:val="24"/>
-                <w:szCs w:val="24"/>
-              </w:rPr>
-              <w:t>.0</w:t>
-            </w:r>
-            <w:r>
-              <w:rPr>
-                <w:b/>
-                <w:spacing w:val="-24"/>
-                <w:sz w:val="24"/>
-                <w:szCs w:val="24"/>
-              </w:rPr>
-              <w:t xml:space="preserve"> </w:t>
-            </w:r>
-            <w:r>
-              <w:t>Atas Nama RONALD NUSSY</w:t>
-            </w:r>
-          </w:p>
-        </w:tc>
-        <w:tc>
-          <w:tcPr>
-            <w:tcW w:w="3092" w:type="dxa"/>
-          </w:tcPr>
-          <w:p>
-            <w:pPr>
-              <w:pStyle w:val="TableParagraph"/>
-              <w:spacing w:line="360" w:lineRule="auto"/>
-              <w:ind w:left="109" w:right="92"/>
-              <w:jc w:val="both"/>
-            </w:pPr>
-            <w:r>
-              <w:t>Bahwa bukti ini membuktikan dan</w:t>
-            </w:r>
-            <w:r>
-              <w:rPr>
-                <w:spacing w:val="-5"/>
-              </w:rPr>
-              <w:t xml:space="preserve"> </w:t>
-            </w:r>
-            <w:r>
-              <w:t>menunjukkan</w:t>
-            </w:r>
-            <w:r>
-              <w:rPr>
-                <w:spacing w:val="-5"/>
-              </w:rPr>
-              <w:t xml:space="preserve"> </w:t>
-            </w:r>
-            <w:r>
-              <w:t>legal</w:t>
-            </w:r>
-            <w:r>
-              <w:rPr>
-                <w:spacing w:val="-5"/>
-              </w:rPr>
-              <w:t xml:space="preserve"> </w:t>
-            </w:r>
-            <w:r>
-              <w:t>standing pemohon sebagai pemilik atas Sertipikat Hak Milik termasuk tanah</w:t>
-            </w:r>
-            <w:r>
-              <w:rPr>
-                <w:spacing w:val="-7"/>
-              </w:rPr>
-              <w:t xml:space="preserve"> </w:t>
-            </w:r>
-            <w:r>
-              <w:t>dan</w:t>
-            </w:r>
-            <w:r>
-              <w:rPr>
-                <w:spacing w:val="-7"/>
-              </w:rPr>
-              <w:t xml:space="preserve"> </w:t>
-            </w:r>
-            <w:r>
-              <w:t>bangunan</w:t>
-            </w:r>
-            <w:r>
-              <w:rPr>
-                <w:spacing w:val="-7"/>
-              </w:rPr>
-              <w:t xml:space="preserve"> </w:t>
-            </w:r>
-            <w:r>
-              <w:t>yang</w:t>
-            </w:r>
-            <w:r>
-              <w:rPr>
-                <w:spacing w:val="-7"/>
-              </w:rPr>
-              <w:t xml:space="preserve"> </w:t>
-            </w:r>
-            <w:r>
-              <w:rPr>
-                <w:spacing w:val="-2"/>
-              </w:rPr>
-              <w:t>berdiri</w:t>
-            </w:r>
-          </w:p>
-          <w:p>
-            <w:pPr>
-              <w:pStyle w:val="TableParagraph"/>
-              <w:spacing w:line="360" w:lineRule="auto"/>
-              <w:ind w:left="109" w:right="92"/>
-              <w:jc w:val="both"/>
-            </w:pPr>
-            <w:r>
-              <w:rPr>
-                <w:spacing w:val="-2"/>
-              </w:rPr>
-              <w:t>diatasnya;</w:t>
-            </w:r>
-          </w:p>
-        </w:tc>
-        <w:tc>
-          <w:tcPr>
-            <w:tcW w:w="1988" w:type="dxa"/>
-          </w:tcPr>
-          <w:p>
-            <w:pPr>
-              <w:pStyle w:val="TableParagraph"/>
-              <w:tabs>
-                <w:tab w:val="left" w:pos="549"/>
-                <w:tab w:val="left" w:pos="1265"/>
-              </w:tabs>
-              <w:spacing w:line="360" w:lineRule="auto"/>
-              <w:ind w:left="108" w:right="99"/>
-              <w:rPr>
-                <w:spacing w:val="-10"/>
-              </w:rPr>
-            </w:pPr>
-            <w:r>
-              <w:rPr>
-                <w:spacing w:val="-10"/>
-              </w:rPr>
-              <w:t>1</w:t>
-            </w:r>
-            <w:r>
-              <w:tab/>
-            </w:r>
-            <w:r>
-              <w:rPr>
-                <w:spacing w:val="-2"/>
-              </w:rPr>
-              <w:t>(satu)</w:t>
-            </w:r>
-            <w:r>
-              <w:tab/>
-            </w:r>
-            <w:r>
-              <w:rPr>
-                <w:spacing w:val="-2"/>
-              </w:rPr>
-              <w:t xml:space="preserve">lembar </w:t>
-            </w:r>
-            <w:r>
-              <w:t>Copy dari Asli</w:t>
-            </w:r>
-          </w:p>
-        </w:tc>
-      </w:tr>
-      <w:tr>
-        <w:trPr>
-          <w:trHeight w:val="1137"/>
-        </w:trPr>
-        <w:tc>
-          <w:tcPr>
-            <w:tcW w:w="1138" w:type="dxa"/>
-          </w:tcPr>
-          <w:p>
-            <w:pPr>
-              <w:pStyle w:val="TableParagraph"/>
-              <w:ind w:left="11"/>
-              <w:jc w:val="center"/>
-            </w:pPr>
-            <w:r>
-              <w:rPr>
-                <w:spacing w:val="-2"/>
-              </w:rPr>
-              <w:t>P-</w:t>
-            </w:r>
-            <w:r>
-              <w:rPr>
-                <w:spacing w:val="-10"/>
-              </w:rPr>
-              <w:t>4</w:t>
-            </w:r>
-          </w:p>
-        </w:tc>
-        <w:tc>
-          <w:tcPr>
-            <w:tcW w:w="3567" w:type="dxa"/>
-          </w:tcPr>
-          <w:p>
-            <w:pPr>
-              <w:pStyle w:val="TableParagraph"/>
-              <w:tabs>
-                <w:tab w:val="left" w:pos="998"/>
-                <w:tab w:val="left" w:pos="1941"/>
-                <w:tab w:val="left" w:pos="2835"/>
-              </w:tabs>
-            </w:pPr>
-            <w:proofErr w:type="spellStart"/>
-            <w:r>
-              <w:rPr>
-                <w:spacing w:val="-2"/>
-              </w:rPr>
-              <w:t>Grosse</w:t>
-            </w:r>
-            <w:proofErr w:type="spellEnd"/>
-            <w:r>
-              <w:tab/>
-            </w:r>
-            <w:r>
-              <w:rPr>
-                <w:spacing w:val="-2"/>
-              </w:rPr>
-              <w:t>Risalah</w:t>
-            </w:r>
-            <w:r>
-              <w:tab/>
-            </w:r>
-            <w:r>
-              <w:rPr>
-                <w:spacing w:val="-2"/>
-              </w:rPr>
-              <w:t>Lelang</w:t>
-            </w:r>
-            <w:r>
-              <w:tab/>
-            </w:r>
-            <w:proofErr w:type="spellStart"/>
-            <w:r>
-              <w:rPr>
-                <w:spacing w:val="-2"/>
-              </w:rPr>
-              <w:t>Nomor</w:t>
-            </w:r>
-            <w:proofErr w:type="spellEnd"/>
-            <w:r>
-              <w:t xml:space="preserve"> </w:t>
-            </w:r>
-            <w:r>
-              <w:rPr>
-                <w:b/>
-                <w:sz w:val="24"/>
-              </w:rPr>
-              <w:t>969/10.01/2025-01 tertanggal 17 November 2025</w:t>
-            </w:r>
-          </w:p>
-        </w:tc>
-        <w:tc>
-          <w:tcPr>
-            <w:tcW w:w="3092" w:type="dxa"/>
-            <w:vMerge w:val="restart"/>
-          </w:tcPr>
-          <w:p>
-            <w:pPr>
-              <w:pStyle w:val="TableParagraph"/>
-              <w:spacing w:line="360" w:lineRule="auto"/>
-              <w:ind w:left="109" w:right="186"/>
-              <w:jc w:val="both"/>
-            </w:pPr>
-            <w:r>
-              <w:t>Bahwa bukti ini membuktikan dan menunjukan bahwa kepemilikan Sertipikat Hak Milik telah Sah beralih kepada pemohon</w:t>
-            </w:r>
-            <w:r>
-              <w:rPr>
-                <w:spacing w:val="-14"/>
-              </w:rPr>
-              <w:t xml:space="preserve"> </w:t>
-            </w:r>
-            <w:r>
-              <w:t>melalui</w:t>
-            </w:r>
-            <w:r>
-              <w:rPr>
-                <w:spacing w:val="-14"/>
-              </w:rPr>
-              <w:t xml:space="preserve"> </w:t>
-            </w:r>
-            <w:r>
-              <w:t>proses</w:t>
-            </w:r>
-            <w:r>
-              <w:rPr>
-                <w:spacing w:val="-14"/>
-              </w:rPr>
-              <w:t xml:space="preserve"> </w:t>
-            </w:r>
-            <w:r>
-              <w:t xml:space="preserve">Lelang Resmi yang diadakan oleh </w:t>
-            </w:r>
-            <w:r>
-              <w:rPr>
-                <w:spacing w:val="-2"/>
-              </w:rPr>
-              <w:t>KPKNL-Surabaya;</w:t>
-            </w:r>
-          </w:p>
-        </w:tc>
-        <w:tc>
-          <w:tcPr>
-            <w:tcW w:w="1988" w:type="dxa"/>
-          </w:tcPr>
-          <w:p>
-            <w:pPr>
-              <w:pStyle w:val="TableParagraph"/>
-              <w:tabs>
-                <w:tab w:val="left" w:pos="491"/>
-                <w:tab w:val="left" w:pos="1265"/>
-              </w:tabs>
-              <w:spacing w:line="360" w:lineRule="auto"/>
-              <w:ind w:left="108" w:right="99"/>
-            </w:pPr>
-            <w:r>
-              <w:rPr>
-                <w:spacing w:val="-10"/>
-              </w:rPr>
-              <w:t>1</w:t>
-            </w:r>
-            <w:r>
-              <w:tab/>
-            </w:r>
-            <w:r>
-              <w:rPr>
-                <w:spacing w:val="-2"/>
-              </w:rPr>
-              <w:t>(satu)</w:t>
-            </w:r>
-            <w:r>
-              <w:tab/>
-            </w:r>
-            <w:r>
-              <w:rPr>
-                <w:spacing w:val="-2"/>
-              </w:rPr>
-              <w:t>bundle</w:t>
-            </w:r>
-            <w:r>
-              <w:rPr>
-                <w:spacing w:val="-2"/>
-              </w:rPr>
-              <w:t xml:space="preserve"> </w:t>
-            </w:r>
-            <w:r>
-              <w:t>Asli</w:t>
-            </w:r>
-          </w:p>
-        </w:tc>
-      </w:tr>
-      <w:tr>
-        <w:trPr>
-          <w:trHeight w:val="1137"/>
-        </w:trPr>
-        <w:tc>
-          <w:tcPr>
-            <w:tcW w:w="1138" w:type="dxa"/>
-          </w:tcPr>
-          <w:p>
-            <w:pPr>
-              <w:pStyle w:val="TableParagraph"/>
-              <w:ind w:left="11"/>
-              <w:jc w:val="center"/>
-            </w:pPr>
-            <w:r>
-              <w:rPr>
-                <w:spacing w:val="-2"/>
-              </w:rPr>
-              <w:t>P-</w:t>
-            </w:r>
-            <w:r>
-              <w:rPr>
-                <w:spacing w:val="-10"/>
-              </w:rPr>
-              <w:t>5</w:t>
-            </w:r>
-          </w:p>
-        </w:tc>
-        <w:tc>
-          <w:tcPr>
-            <w:tcW w:w="3567" w:type="dxa"/>
-          </w:tcPr>
-          <w:p>
-            <w:pPr>
-              <w:pStyle w:val="TableParagraph"/>
-              <w:tabs>
-                <w:tab w:val="left" w:pos="1392"/>
-                <w:tab w:val="left" w:pos="2302"/>
-                <w:tab w:val="left" w:pos="3001"/>
-                <w:tab w:val="left" w:pos="3237"/>
-              </w:tabs>
-              <w:spacing w:line="360" w:lineRule="auto"/>
-              <w:ind w:right="96"/>
-            </w:pPr>
-            <w:proofErr w:type="spellStart"/>
-            <w:r>
-              <w:rPr>
-                <w:spacing w:val="-2"/>
-              </w:rPr>
-              <w:t>Kwitansi</w:t>
-            </w:r>
-            <w:proofErr w:type="spellEnd"/>
-            <w:r>
-              <w:tab/>
-            </w:r>
-            <w:proofErr w:type="spellStart"/>
-            <w:r>
-              <w:rPr>
-                <w:spacing w:val="-2"/>
-              </w:rPr>
-              <w:t>Nomor</w:t>
-            </w:r>
-            <w:proofErr w:type="spellEnd"/>
-            <w:r>
-              <w:rPr>
-                <w:spacing w:val="-2"/>
-              </w:rPr>
-              <w:t xml:space="preserve"> :</w:t>
-            </w:r>
-            <w:r>
-              <w:rPr>
-                <w:spacing w:val="-2"/>
-              </w:rPr>
-              <w:t xml:space="preserve"> </w:t>
-            </w:r>
-            <w:r>
-              <w:rPr>
-                <w:b/>
-                <w:sz w:val="24"/>
-              </w:rPr>
-              <w:t>1165/KNL.1001/2025-YEUBNM Tanggal 17 November 2025</w:t>
-            </w:r>
-            <w:r>
-              <w:t xml:space="preserve"> </w:t>
-            </w:r>
-            <w:r>
-              <w:rPr>
-                <w:b/>
-                <w:spacing w:val="-4"/>
-              </w:rPr>
-              <w:t>;</w:t>
-            </w:r>
-          </w:p>
-        </w:tc>
-        <w:tc>
-          <w:tcPr>
-            <w:tcW w:w="3092" w:type="dxa"/>
-            <w:vMerge/>
-            <w:tcBorders>
-              <w:top w:val="nil"/>
-            </w:tcBorders>
-          </w:tcPr>
-          <w:p>
-            <w:pPr>
-              <w:rPr>
-                <w:sz w:val="2"/>
-                <w:szCs w:val="2"/>
-              </w:rPr>
-            </w:pPr>
-          </w:p>
-        </w:tc>
-        <w:tc>
-          <w:tcPr>
-            <w:tcW w:w="1988" w:type="dxa"/>
-          </w:tcPr>
-          <w:p>
-            <w:pPr>
-              <w:pStyle w:val="TableParagraph"/>
-              <w:tabs>
-                <w:tab w:val="left" w:pos="491"/>
-                <w:tab w:val="left" w:pos="1265"/>
-              </w:tabs>
-              <w:spacing w:line="360" w:lineRule="auto"/>
-              <w:ind w:left="108" w:right="99"/>
-            </w:pPr>
-            <w:r>
-              <w:rPr>
-                <w:spacing w:val="-10"/>
-              </w:rPr>
-              <w:t>1</w:t>
-            </w:r>
-            <w:r>
-              <w:tab/>
-            </w:r>
-            <w:r>
-              <w:rPr>
-                <w:spacing w:val="-2"/>
-              </w:rPr>
-              <w:t>(satu)</w:t>
-            </w:r>
-            <w:r>
-              <w:tab/>
-            </w:r>
-            <w:r>
-              <w:rPr>
-                <w:spacing w:val="-2"/>
-              </w:rPr>
-              <w:t xml:space="preserve">lembar </w:t>
-            </w:r>
-            <w:r>
-              <w:t>Copy dari Asli</w:t>
-            </w:r>
-          </w:p>
-        </w:tc>
-      </w:tr>
-    </w:tbl>
-    <w:p>
-      <w:pPr>
-        <w:pStyle w:val="TableParagraph"/>
-        <w:spacing w:line="360" w:lineRule="auto"/>
-        <w:ind w:left="0"/>
-      </w:pPr>
-    </w:p>
-    <w:tbl>
-      <w:tblPr>
-        <w:tblStyle w:val="TableGrid"/>
-        <w:tblW w:w="0" w:type="auto"/>
-        <w:tblInd w:w="288" w:type="dxa"/>
-        <w:tblLook w:val="04A0" w:firstRow="1" w:lastRow="0" w:firstColumn="1" w:lastColumn="0" w:noHBand="0" w:noVBand="1"/>
-      </w:tblPr>
-      <w:tblGrid>
-        <w:gridCol w:w="1320"/>
-        <w:gridCol w:w="3619"/>
-        <w:gridCol w:w="2477"/>
-        <w:gridCol w:w="2475"/>
-      </w:tblGrid>
-      <w:tr>
-        <w:trPr>
-          <w:trHeight w:val="2954"/>
-        </w:trPr>
-        <w:tc>
-          <w:tcPr>
-            <w:tcW w:w="1320" w:type="dxa"/>
-          </w:tcPr>
-          <w:p>
-            <w:pPr>
-              <w:pStyle w:val="TableParagraph"/>
-              <w:spacing w:line="360" w:lineRule="auto"/>
-              <w:ind w:left="0"/>
-            </w:pPr>
-            <w:r>
-              <w:rPr>
-                <w:spacing w:val="-2"/>
-              </w:rPr>
-              <w:t>P-</w:t>
-            </w:r>
-            <w:r>
-              <w:rPr>
-                <w:spacing w:val="-10"/>
-              </w:rPr>
-              <w:t>6</w:t>
-            </w:r>
-          </w:p>
-        </w:tc>
-        <w:tc>
-          <w:tcPr>
-            <w:tcW w:w="3619" w:type="dxa"/>
-          </w:tcPr>
-          <w:p>
-            <w:pPr>
-              <w:pStyle w:val="TableParagraph"/>
-              <w:tabs>
-                <w:tab w:val="left" w:pos="1043"/>
-                <w:tab w:val="left" w:pos="1933"/>
-                <w:tab w:val="left" w:pos="2774"/>
-              </w:tabs>
-              <w:spacing w:before="5" w:line="360" w:lineRule="auto"/>
-              <w:ind w:left="0"/>
-            </w:pPr>
-            <w:r>
-              <w:rPr>
-                <w:spacing w:val="-2"/>
-              </w:rPr>
-              <w:t>Kutipan</w:t>
-            </w:r>
-            <w:r>
-              <w:tab/>
-            </w:r>
-            <w:r>
-              <w:rPr>
-                <w:spacing w:val="-2"/>
-              </w:rPr>
-              <w:t>Risalah</w:t>
-            </w:r>
-            <w:r>
-              <w:tab/>
-            </w:r>
-            <w:r>
-              <w:rPr>
-                <w:spacing w:val="-2"/>
-              </w:rPr>
-              <w:t>Lelang</w:t>
-            </w:r>
-            <w:r>
-              <w:t xml:space="preserve"> </w:t>
-            </w:r>
-            <w:proofErr w:type="spellStart"/>
-            <w:r>
-              <w:rPr>
-                <w:spacing w:val="-2"/>
-              </w:rPr>
-              <w:t>Nomor</w:t>
-            </w:r>
-            <w:proofErr w:type="spellEnd"/>
-            <w:r>
-              <w:rPr>
-                <w:spacing w:val="-2"/>
-              </w:rPr>
-              <w:t>:</w:t>
-            </w:r>
-            <w:r>
-              <w:t xml:space="preserve"> </w:t>
-            </w:r>
-            <w:r>
-              <w:rPr>
-                <w:b/>
-                <w:sz w:val="24"/>
-              </w:rPr>
-              <w:t>1165/KNL.1001/2025-YEUBNM Tanggal 17 November 2025</w:t>
-            </w:r>
-            <w:r>
-              <w:rPr>
-                <w:sz w:val="24"/>
-              </w:rPr>
-              <w:t>;</w:t>
-            </w:r>
-          </w:p>
-        </w:tc>
-        <w:tc>
-          <w:tcPr>
-            <w:tcW w:w="2477" w:type="dxa"/>
-          </w:tcPr>
-          <w:p>
-            <w:pPr>
-              <w:pStyle w:val="TableParagraph"/>
-              <w:spacing w:line="360" w:lineRule="auto"/>
-              <w:ind w:left="0"/>
-            </w:pPr>
-            <w:r>
-              <w:t xml:space="preserve">Bahwa bukti ini membuktikan dan menunjukan bahwa </w:t>
-            </w:r>
-            <w:r>
-              <w:t>kepemilikan Sertipikat Hak Guna Bangunan</w:t>
-            </w:r>
-            <w:r>
-              <w:t xml:space="preserve"> telah Sah beralih kepada pemohon</w:t>
-            </w:r>
-            <w:r>
-              <w:rPr>
-                <w:spacing w:val="-14"/>
-              </w:rPr>
-              <w:t xml:space="preserve"> </w:t>
-            </w:r>
-            <w:r>
-              <w:t>melalui</w:t>
-            </w:r>
-            <w:r>
-              <w:rPr>
-                <w:spacing w:val="-14"/>
-              </w:rPr>
-              <w:t xml:space="preserve"> </w:t>
-            </w:r>
-            <w:r>
-              <w:t>proses</w:t>
-            </w:r>
-            <w:r>
-              <w:rPr>
-                <w:spacing w:val="-14"/>
-              </w:rPr>
-              <w:t xml:space="preserve"> </w:t>
-            </w:r>
-            <w:r>
-              <w:t xml:space="preserve">Lelang Resmi yang </w:t>
-            </w:r>
-            <w:r>
-              <w:lastRenderedPageBreak/>
-              <w:t xml:space="preserve">diadakan oleh </w:t>
-            </w:r>
-            <w:r>
-              <w:rPr>
-                <w:spacing w:val="-2"/>
-              </w:rPr>
-              <w:t>KPKNL-Surabaya;</w:t>
-            </w:r>
-          </w:p>
-        </w:tc>
-        <w:tc>
-          <w:tcPr>
-            <w:tcW w:w="2475" w:type="dxa"/>
-          </w:tcPr>
-          <w:p>
-            <w:pPr>
-              <w:pStyle w:val="TableParagraph"/>
-              <w:spacing w:line="360" w:lineRule="auto"/>
-              <w:ind w:left="0"/>
-            </w:pPr>
-            <w:r>
-              <w:rPr>
-                <w:spacing w:val="-10"/>
-              </w:rPr>
-              <w:lastRenderedPageBreak/>
-              <w:t>1</w:t>
-            </w:r>
-            <w:r>
-              <w:tab/>
-            </w:r>
-            <w:r>
-              <w:rPr>
-                <w:spacing w:val="-2"/>
-              </w:rPr>
-              <w:t>(satu)</w:t>
-            </w:r>
-            <w:r>
-              <w:tab/>
-            </w:r>
-            <w:r>
-              <w:rPr>
-                <w:spacing w:val="-2"/>
-              </w:rPr>
-              <w:t xml:space="preserve">lembar </w:t>
-            </w:r>
-            <w:r>
-              <w:t>Copy dari Asli</w:t>
-            </w:r>
-          </w:p>
-        </w:tc>
-      </w:tr>
-    </w:tbl>
-    <w:p>
-      <w:pPr>
-        <w:pStyle w:val="TableParagraph"/>
-        <w:spacing w:line="360" w:lineRule="auto"/>
-      </w:pPr>
-    </w:p>
-    <w:p>
-      <w:pPr>
-        <w:pStyle w:val="TableParagraph"/>
-        <w:spacing w:line="360" w:lineRule="auto"/>
-      </w:pPr>
-    </w:p>
-    <w:p>
-      <w:pPr>
-        <w:pStyle w:val="BodyText"/>
-        <w:spacing w:before="68"/>
-        <w:ind w:left="458"/>
-        <w:rPr>
-          <w:rFonts w:ascii="Times New Roman" w:hAnsi="Times New Roman" w:cs="Times New Roman"/>
-          <w:spacing w:val="-4"/>
-        </w:rPr>
-      </w:pPr>
-      <w:r>
-        <w:rPr>
-          <w:rFonts w:ascii="Times New Roman" w:hAnsi="Times New Roman" w:cs="Times New Roman"/>
-        </w:rPr>
-        <w:t>Demikianlah</w:t>
-      </w:r>
-      <w:r>
-        <w:rPr>
-          <w:rFonts w:ascii="Times New Roman" w:hAnsi="Times New Roman" w:cs="Times New Roman"/>
-          <w:spacing w:val="-6"/>
-        </w:rPr>
-        <w:t xml:space="preserve"> </w:t>
-      </w:r>
-      <w:r>
-        <w:rPr>
-          <w:rFonts w:ascii="Times New Roman" w:hAnsi="Times New Roman" w:cs="Times New Roman"/>
-        </w:rPr>
-        <w:t>alat</w:t>
-      </w:r>
-      <w:r>
-        <w:rPr>
-          <w:rFonts w:ascii="Times New Roman" w:hAnsi="Times New Roman" w:cs="Times New Roman"/>
-          <w:spacing w:val="-4"/>
-        </w:rPr>
-        <w:t xml:space="preserve"> </w:t>
-      </w:r>
-      <w:r>
-        <w:rPr>
-          <w:rFonts w:ascii="Times New Roman" w:hAnsi="Times New Roman" w:cs="Times New Roman"/>
-        </w:rPr>
-        <w:t>bukti</w:t>
-      </w:r>
-      <w:r>
-        <w:rPr>
-          <w:rFonts w:ascii="Times New Roman" w:hAnsi="Times New Roman" w:cs="Times New Roman"/>
-          <w:spacing w:val="-4"/>
-        </w:rPr>
-        <w:t xml:space="preserve"> </w:t>
-      </w:r>
-      <w:r>
-        <w:rPr>
-          <w:rFonts w:ascii="Times New Roman" w:hAnsi="Times New Roman" w:cs="Times New Roman"/>
-        </w:rPr>
-        <w:t>ini</w:t>
-      </w:r>
-      <w:r>
-        <w:rPr>
-          <w:rFonts w:ascii="Times New Roman" w:hAnsi="Times New Roman" w:cs="Times New Roman"/>
-          <w:spacing w:val="-4"/>
-        </w:rPr>
-        <w:t xml:space="preserve"> </w:t>
-      </w:r>
-      <w:r>
-        <w:rPr>
-          <w:rFonts w:ascii="Times New Roman" w:hAnsi="Times New Roman" w:cs="Times New Roman"/>
-        </w:rPr>
-        <w:t>kami</w:t>
-      </w:r>
-      <w:r>
-        <w:rPr>
-          <w:rFonts w:ascii="Times New Roman" w:hAnsi="Times New Roman" w:cs="Times New Roman"/>
-          <w:spacing w:val="-3"/>
-        </w:rPr>
-        <w:t xml:space="preserve"> </w:t>
-      </w:r>
-      <w:r>
-        <w:rPr>
-          <w:rFonts w:ascii="Times New Roman" w:hAnsi="Times New Roman" w:cs="Times New Roman"/>
-        </w:rPr>
-        <w:t>ajukan</w:t>
-      </w:r>
-      <w:r>
-        <w:rPr>
-          <w:rFonts w:ascii="Times New Roman" w:hAnsi="Times New Roman" w:cs="Times New Roman"/>
-          <w:spacing w:val="-9"/>
-        </w:rPr>
-        <w:t xml:space="preserve"> </w:t>
-      </w:r>
-      <w:r>
-        <w:rPr>
-          <w:rFonts w:ascii="Times New Roman" w:hAnsi="Times New Roman" w:cs="Times New Roman"/>
-        </w:rPr>
-        <w:t>Terima</w:t>
-      </w:r>
-      <w:r>
-        <w:rPr>
-          <w:rFonts w:ascii="Times New Roman" w:hAnsi="Times New Roman" w:cs="Times New Roman"/>
-          <w:spacing w:val="-4"/>
-        </w:rPr>
-        <w:t xml:space="preserve"> Kasih</w:t>
-      </w:r>
-    </w:p>
-    <w:p>
-      <w:pPr>
-        <w:pStyle w:val="BodyText"/>
-        <w:spacing w:before="68"/>
-        <w:ind w:left="458"/>
-        <w:rPr>
-          <w:rFonts w:ascii="Times New Roman" w:hAnsi="Times New Roman" w:cs="Times New Roman"/>
-          <w:spacing w:val="-4"/>
-        </w:rPr>
-      </w:pPr>
-    </w:p>
-    <w:p>
-      <w:pPr>
-        <w:pStyle w:val="BodyText"/>
-        <w:spacing w:before="68"/>
-        <w:ind w:left="458"/>
-        <w:jc w:val="center"/>
-        <w:rPr>
-          <w:rFonts w:ascii="Times New Roman" w:hAnsi="Times New Roman" w:cs="Times New Roman"/>
-          <w:spacing w:val="-4"/>
-        </w:rPr>
-      </w:pPr>
-      <w:r>
-        <w:rPr>
-          <w:rFonts w:ascii="Times New Roman" w:hAnsi="Times New Roman" w:cs="Times New Roman"/>
-          <w:spacing w:val="-4"/>
-        </w:rPr>
-        <w:t xml:space="preserve">Surabaya, </w:t>
-      </w:r>
-      <w:r>
-        <w:rPr>
-          <w:rFonts w:ascii="Times New Roman" w:hAnsi="Times New Roman" w:cs="Times New Roman"/>
-          <w:spacing w:val="-4"/>
-        </w:rPr>
-        <w:t xml:space="preserve">12 </w:t>
-      </w:r>
-      <w:r>
-        <w:rPr>
-          <w:rFonts w:ascii="Times New Roman" w:hAnsi="Times New Roman" w:cs="Times New Roman"/>
-          <w:spacing w:val="-4"/>
-        </w:rPr>
-        <w:t>Desember 2025</w:t>
-      </w:r>
-    </w:p>
-    <w:p>
-      <w:pPr>
-        <w:spacing w:before="1" w:line="504" w:lineRule="auto"/>
-        <w:ind w:left="4605" w:right="3724"/>
-        <w:rPr>
-          <w:rFonts w:ascii="Times New Roman" w:hAnsi="Times New Roman" w:cs="Times New Roman"/>
-          <w:b/>
-          <w:sz w:val="24"/>
-        </w:rPr>
-      </w:pPr>
-      <w:r>
-        <w:rPr>
-          <w:rFonts w:ascii="Times New Roman" w:hAnsi="Times New Roman" w:cs="Times New Roman"/>
-          <w:sz w:val="24"/>
-        </w:rPr>
-        <w:t>Hormat kami</w:t>
-      </w:r>
-    </w:p>
-    <w:p>
-      <w:pPr>
-        <w:spacing w:before="1" w:line="504" w:lineRule="auto"/>
-        <w:ind w:left="3885" w:right="3724" w:firstLine="288"/>
-        <w:rPr>
-          <w:rFonts w:ascii="Times New Roman" w:hAnsi="Times New Roman" w:cs="Times New Roman"/>
-          <w:b/>
-          <w:sz w:val="24"/>
-        </w:rPr>
-      </w:pPr>
-    </w:p>
-    <w:p>
-      <w:pPr>
-        <w:pStyle w:val="Heading3"/>
-        <w:spacing w:before="172"/>
-        <w:ind w:left="0" w:right="435"/>
-        <w:rPr>
-          <w:rFonts w:ascii="Times New Roman" w:hAnsi="Times New Roman" w:cs="Times New Roman"/>
-        </w:rPr>
-      </w:pPr>
-    </w:p>
-    <w:p>
-      <w:pPr>
-        <w:pStyle w:val="Heading3"/>
-        <w:spacing w:before="172"/>
-        <w:ind w:left="3600" w:right="435"/>
-        <w:rPr>
-          <w:rFonts w:ascii="Times New Roman" w:hAnsi="Times New Roman" w:cs="Times New Roman"/>
-        </w:rPr>
-      </w:pPr>
-      <w:r>
-        <w:rPr>
-          <w:rFonts w:ascii="Times New Roman" w:hAnsi="Times New Roman" w:cs="Times New Roman"/>
-        </w:rPr>
-        <w:t xml:space="preserve">    </w:t>
-      </w:r>
-      <w:r>
-        <w:rPr>
-          <w:rFonts w:ascii="Times New Roman" w:hAnsi="Times New Roman" w:cs="Times New Roman"/>
-        </w:rPr>
-        <w:t>VENATHA TANOTO, S.H</w:t>
-      </w:r>
-    </w:p>
-    <w:p>
-      <w:pPr>
-        <w:pStyle w:val="BodyText"/>
-        <w:spacing w:before="68"/>
-        <w:ind w:left="458"/>
-        <w:rPr>
-          <w:rFonts w:ascii="Times New Roman" w:hAnsi="Times New Roman" w:cs="Times New Roman"/>
           <w:spacing w:val="-4"/>
         </w:rPr>
       </w:pPr>

</xml_diff>